<commit_message>
Use generated sample files in the python-net docs
In the context of the GroupDocs.Watermark for Python via .NET 26.10
release. The sample files now come from GroupDocs.Watermark-SampleFiles,
which builds each one to contain what its examples look for and checks
it with the product.

- _sample_files: synced from the generator. 12 pages that linked
  flattened or parent-folder copies now link their own folder; the
  stale copies are removed.
- _output_files: regenerated, including the images-inside page;
  orphans under old paths removed.
- Snippets: the unprotect example opens protected-document.docx; the
  hyperlink-removal regex matches the sample's review link; the
  spreadsheet attachment examples skip linked attachments, which have
  no content.
- Prose: the PDF attachment listing and output sizes match the new
  files.
</commit_message>
<xml_diff>
--- a/python-net/_output_files/developer-guide/advanced-usage/adding-watermarks/add-watermarks-to-word-processing-documents/existing-objects-in-word-processing-document/remove_and_modify_shapes/output.docx
+++ b/python-net/_output_files/developer-guide/advanced-usage/adding-watermarks/add-watermarks-to-word-processing-documents/existing-objects-in-word-processing-document/remove_and_modify_shapes/output.docx
@@ -1,17 +1,145 @@
 
 <file path=word/document.xml><?xml version="1.0" encoding="utf-8"?>
-<w:document xmlns:wpc="http://schemas.microsoft.com/office/word/2010/wordprocessingCanvas" xmlns:cx="http://schemas.microsoft.com/office/drawing/2014/chartex" xmlns:cx1="http://schemas.microsoft.com/office/drawing/2015/9/8/chartex" xmlns:cx2="http://schemas.microsoft.com/office/drawing/2015/10/21/chartex" xmlns:cx3="http://schemas.microsoft.com/office/drawing/2016/5/9/chartex" xmlns:cx4="http://schemas.microsoft.com/office/drawing/2016/5/10/chartex" xmlns:cx5="http://schemas.microsoft.com/office/drawing/2016/5/11/chartex" xmlns:mc="http://schemas.openxmlformats.org/markup-compatibility/2006" xmlns:o="urn:schemas-microsoft-com:office:office" xmlns:r="http://schemas.openxmlformats.org/officeDocument/2006/relationships" xmlns:m="http://schemas.openxmlformats.org/officeDocument/2006/math" xmlns:v="urn:schemas-microsoft-com:vml" xmlns:wp14="http://schemas.microsoft.com/office/word/2010/wordprocessingDrawing" xmlns:wp="http://schemas.openxmlformats.org/drawingml/2006/wordprocessingDrawing" xmlns:w10="urn:schemas-microsoft-com:office:word" xmlns:w="http://schemas.openxmlformats.org/wordprocessingml/2006/main" xmlns:w14="http://schemas.microsoft.com/office/word/2010/wordml" xmlns:w15="http://schemas.microsoft.com/office/word/2012/wordml" xmlns:wne="http://schemas.microsoft.com/office/word/2006/wordml" xmlns:wpg="http://schemas.microsoft.com/office/word/2010/wordprocessingGroup" xmlns:wpi="http://schemas.microsoft.com/office/word/2010/wordprocessingInk" xmlns:wps="http://schemas.microsoft.com/office/word/2010/wordprocessingShape" mc:Ignorable="w14 w15 wp14">
+<w:document xmlns:ve="http://schemas.openxmlformats.org/markup-compatibility/2006" xmlns:o="urn:schemas-microsoft-com:office:office" xmlns:r="http://schemas.openxmlformats.org/officeDocument/2006/relationships" xmlns:m="http://schemas.openxmlformats.org/officeDocument/2006/math" xmlns:v="urn:schemas-microsoft-com:vml" xmlns:wp="http://schemas.openxmlformats.org/drawingml/2006/wordprocessingDrawing" xmlns:w10="urn:schemas-microsoft-com:office:word" xmlns:w="http://schemas.openxmlformats.org/wordprocessingml/2006/main" xmlns:wne="http://schemas.microsoft.com/office/word/2006/wordml">
   <!-- Generated by Aspose.Words for .NET 25.7.0 -->
   <w:body>
     <w:p>
       <w:pPr>
+        <w:pStyle w:val="Title"/>
+        <w:rPr>
+          <w:color w:val="1B2A4A"/>
+        </w:rPr>
+      </w:pPr>
+      <w:r>
+        <w:rPr>
+          <w:color w:val="1B2A4A"/>
+        </w:rPr>
+        <w:t>Campaign Report 2026</w:t>
+      </w:r>
+    </w:p>
+    <w:p>
+      <w:pPr>
+        <w:pStyle w:val="Subtitle"/>
+      </w:pPr>
+      <w:r>
+        <w:t>Launch campaign for Northwind Coffee Roasters — results and selected frames</w:t>
+      </w:r>
+    </w:p>
+    <w:p>
+      <w:pPr>
+        <w:pStyle w:val="Heading1"/>
+        <w:rPr>
+          <w:color w:val="1B2A4A"/>
+        </w:rPr>
+      </w:pPr>
+      <w:r>
+        <w:rPr>
+          <w:color w:val="1B2A4A"/>
+        </w:rPr>
+        <w:t>Summary</w:t>
+      </w:r>
+    </w:p>
+    <w:p>
+      <w:r>
+        <w:t>The spring launch introduced Northwind Coffee Roasters' refreshed identity across social, retail and out-of-home channels. Photography from the Northern Light series anchored every placement, and all pre-release assets were delivered watermark-protected until sign-off.</w:t>
+      </w:r>
+    </w:p>
+    <w:p>
+      <w:pPr>
+        <w:numPr>
+          <w:ilvl w:val="0"/>
+          <w:numId w:val="1"/>
+        </w:numPr>
+      </w:pPr>
+      <w:r>
+        <w:t>1.8 million impressions across paid and organic social in six weeks.</w:t>
+      </w:r>
+    </w:p>
+    <w:p>
+      <w:pPr>
+        <w:numPr>
+          <w:ilvl w:val="0"/>
+          <w:numId w:val="1"/>
+        </w:numPr>
+      </w:pPr>
+      <w:r>
+        <w:t>Store traffic up 14% in launch cities versus the prior quarter.</w:t>
+      </w:r>
+    </w:p>
+    <w:p>
+      <w:pPr>
+        <w:numPr>
+          <w:ilvl w:val="0"/>
+          <w:numId w:val="1"/>
+        </w:numPr>
+      </w:pPr>
+      <w:r>
+        <w:t>42 approved hero frames delivered, 12 motion clips, one 60-second brand film.</w:t>
+      </w:r>
+    </w:p>
+    <w:p>
+      <w:pPr>
+        <w:pStyle w:val="Heading1"/>
+        <w:numPr>
+          <w:ilvl w:val="0"/>
+          <w:numId w:val="0"/>
+        </w:numPr>
+        <w:rPr>
+          <w:color w:val="1B2A4A"/>
+        </w:rPr>
+      </w:pPr>
+      <w:r>
+        <w:rPr>
+          <w:color w:val="1B2A4A"/>
+        </w:rPr>
+        <w:t>Approach</w:t>
+      </w:r>
+    </w:p>
+    <w:p>
+      <w:pPr>
+        <w:numPr>
+          <w:ilvl w:val="0"/>
+          <w:numId w:val="0"/>
+        </w:numPr>
+      </w:pPr>
+      <w:r>
+        <w:t>Each placement used one hero photograph with a consistent amber accent, so the campaign reads as one story from billboard to bag label. Drafts circulated with a visible CONFIDENTIAL mark and a locked studio watermark; approved finals were released clean.</w:t>
+      </w:r>
+    </w:p>
+    <w:p>
+      <w:pPr>
+        <w:pStyle w:val="Heading1"/>
+        <w:numPr>
+          <w:ilvl w:val="0"/>
+          <w:numId w:val="0"/>
+        </w:numPr>
+        <w:rPr>
+          <w:color w:val="1B2A4A"/>
+        </w:rPr>
+      </w:pPr>
+      <w:r>
+        <w:br w:type="page"/>
+      </w:r>
+      <w:r>
+        <w:rPr>
+          <w:color w:val="1B2A4A"/>
+        </w:rPr>
+        <w:t>Selected frames</w:t>
+      </w:r>
+    </w:p>
+    <w:p>
+      <w:pPr>
+        <w:numPr>
+          <w:ilvl w:val="0"/>
+          <w:numId w:val="0"/>
+        </w:numPr>
         <w:jc w:val="center"/>
       </w:pPr>
       <w:r>
         <w:drawing>
           <wp:inline>
-            <wp:extent cx="2921000" cy="876300"/>
-            <wp:docPr id="100001" name=""/>
+            <wp:extent cx="3810000" cy="2381250"/>
+            <wp:docPr id="100004" name="Photo: First Roast — Dawn"/>
             <wp:cNvGraphicFramePr>
               <a:graphicFrameLocks xmlns:a="http://schemas.openxmlformats.org/drawingml/2006/main" noChangeAspect="1"/>
             </wp:cNvGraphicFramePr>
@@ -19,7 +147,7 @@
               <a:graphicData uri="http://schemas.openxmlformats.org/drawingml/2006/picture">
                 <pic:pic xmlns:pic="http://schemas.openxmlformats.org/drawingml/2006/picture">
                   <pic:nvPicPr>
-                    <pic:cNvPr id="100001" name=""/>
+                    <pic:cNvPr id="100004" name=""/>
                     <pic:cNvPicPr>
                       <a:picLocks noChangeAspect="1"/>
                     </pic:cNvPicPr>
@@ -33,7 +161,7 @@
                   <pic:spPr>
                     <a:xfrm>
                       <a:off x="0" y="0"/>
-                      <a:ext cx="2921000" cy="876300"/>
+                      <a:ext cx="3810000" cy="2381250"/>
                     </a:xfrm>
                     <a:prstGeom prst="rect">
                       <a:avLst/>
@@ -48,154 +176,37 @@
     </w:p>
     <w:p>
       <w:pPr>
-        <w:jc w:val="center"/>
-      </w:pPr>
-    </w:p>
-    <w:p>
-      <w:pPr>
-        <w:pStyle w:val="Title"/>
+        <w:numPr>
+          <w:ilvl w:val="0"/>
+          <w:numId w:val="0"/>
+        </w:numPr>
         <w:jc w:val="center"/>
         <w:rPr>
-          <w:color w:val="1B2A4A"/>
+          <w:color w:val="5B6472"/>
+          <w:sz w:val="18"/>
         </w:rPr>
       </w:pPr>
       <w:r>
         <w:rPr>
-          <w:color w:val="1B2A4A"/>
+          <w:color w:val="5B6472"/>
+          <w:sz w:val="18"/>
         </w:rPr>
-        <w:t>Project Proposal</w:t>
+        <w:t>First Roast — Dawn</w:t>
       </w:r>
     </w:p>
     <w:p>
       <w:pPr>
-        <w:spacing w:after="200"/>
+        <w:numPr>
+          <w:ilvl w:val="0"/>
+          <w:numId w:val="0"/>
+        </w:numPr>
         <w:jc w:val="center"/>
-      </w:pPr>
-      <w:r>
-        <mc:AlternateContent>
-          <mc:Choice Requires="wps">
-            <w:drawing>
-              <wp:inline>
-                <wp:extent cx="1143000" cy="38100"/>
-                <wp:effectExtent l="0" t="0" r="19050" b="19050"/>
-                <wp:docPr id="100004" name="Rectangle 100004"/>
-                <wp:cNvGraphicFramePr/>
-                <a:graphic xmlns:a="http://schemas.openxmlformats.org/drawingml/2006/main">
-                  <a:graphicData uri="http://schemas.microsoft.com/office/word/2010/wordprocessingShape">
-                    <wps:wsp xmlns:wps="http://schemas.microsoft.com/office/word/2010/wordprocessingShape">
-                      <wps:cNvSpPr/>
-                      <wps:spPr>
-                        <a:xfrm>
-                          <a:off x="0" y="0"/>
-                          <a:ext cx="1143000" cy="38100"/>
-                        </a:xfrm>
-                        <a:prstGeom prst="rect">
-                          <a:avLst/>
-                        </a:prstGeom>
-                        <a:solidFill>
-                          <a:srgbClr val="E8A33D"/>
-                        </a:solidFill>
-                        <a:ln>
-                          <a:noFill/>
-                        </a:ln>
-                      </wps:spPr>
-                      <wps:style>
-                        <a:lnRef idx="2">
-                          <a:schemeClr val="accent1">
-                            <a:shade val="50000"/>
-                          </a:schemeClr>
-                        </a:lnRef>
-                        <a:fillRef idx="1">
-                          <a:schemeClr val="accent1"/>
-                        </a:fillRef>
-                        <a:effectRef idx="0">
-                          <a:schemeClr val="accent1"/>
-                        </a:effectRef>
-                        <a:fontRef idx="minor">
-                          <a:schemeClr val="lt1"/>
-                        </a:fontRef>
-                      </wps:style>
-                      <wps:bodyPr anchor="ctr" compatLnSpc="1">
-                        <a:prstTxWarp prst="textNoShape">
-                          <a:avLst/>
-                        </a:prstTxWarp>
-                      </wps:bodyPr>
-                    </wps:wsp>
-                  </a:graphicData>
-                </a:graphic>
-              </wp:inline>
-            </w:drawing>
-          </mc:Choice>
-          <mc:Fallback>
-            <w:pict>
-              <v:rect id="Rectangle 100004" o:spid="_x0000_i1025" style="width:90pt;height:3pt;v-text-anchor:middle" fillcolor="#e8a33d" stroked="f" strokecolor="#385d8a" strokeweight="2pt">
-                <w10:anchorlock/>
-              </v:rect>
-            </w:pict>
-          </mc:Fallback>
-        </mc:AlternateContent>
-      </w:r>
-    </w:p>
-    <w:p>
-      <w:pPr>
-        <w:pStyle w:val="Subtitle"/>
-        <w:spacing w:after="200"/>
-        <w:jc w:val="center"/>
-      </w:pPr>
-      <w:r>
-        <w:t>Prepared for Northwind Coffee Roasters</w:t>
-      </w:r>
-    </w:p>
-    <w:p>
-      <w:pPr>
-        <w:spacing w:after="200"/>
-        <w:jc w:val="center"/>
-        <w:rPr>
-          <w:color w:val="5B6472"/>
-        </w:rPr>
-      </w:pPr>
-      <w:r>
-        <w:rPr>
-          <w:color w:val="5B6472"/>
-        </w:rPr>
-        <w:t>Photography · Brand Design · Motion   ·   2026</w:t>
-      </w:r>
-    </w:p>
-    <w:p>
-      <w:pPr>
-        <w:spacing w:after="200"/>
-        <w:jc w:val="center"/>
-        <w:rPr>
-          <w:color w:val="5B6472"/>
-        </w:rPr>
-      </w:pPr>
-      <w:r>
-        <w:rPr>
-          <w:color w:val="5B6472"/>
-        </w:rPr>
-        <w:t>Prepared by Mara Lindqvist, Creative Director</w:t>
-      </w:r>
-    </w:p>
-    <w:p>
-      <w:pPr>
-        <w:spacing w:after="200"/>
-        <w:jc w:val="center"/>
-      </w:pPr>
-    </w:p>
-    <w:p>
-      <w:pPr>
-        <w:pStyle w:val="Heading1"/>
-        <w:spacing w:after="200"/>
-        <w:jc w:val="left"/>
-        <w:rPr>
-          <w:color w:val="1B2A4A"/>
-        </w:rPr>
       </w:pPr>
       <w:r>
         <w:drawing>
           <wp:inline>
-            <wp:extent cx="5842000" cy="3644900"/>
-            <wp:docPr id="100005" name=""/>
+            <wp:extent cx="3810000" cy="2381250"/>
+            <wp:docPr id="100006" name="Photo: Harbour Blue"/>
             <wp:cNvGraphicFramePr>
               <a:graphicFrameLocks xmlns:a="http://schemas.openxmlformats.org/drawingml/2006/main" noChangeAspect="1"/>
             </wp:cNvGraphicFramePr>
@@ -203,7 +214,7 @@
               <a:graphicData uri="http://schemas.openxmlformats.org/drawingml/2006/picture">
                 <pic:pic xmlns:pic="http://schemas.openxmlformats.org/drawingml/2006/picture">
                   <pic:nvPicPr>
-                    <pic:cNvPr id="100005" name=""/>
+                    <pic:cNvPr id="100006" name=""/>
                     <pic:cNvPicPr>
                       <a:picLocks noChangeAspect="1"/>
                     </pic:cNvPicPr>
@@ -217,7 +228,7 @@
                   <pic:spPr>
                     <a:xfrm>
                       <a:off x="0" y="0"/>
-                      <a:ext cx="5842000" cy="3644900"/>
+                      <a:ext cx="3810000" cy="2381250"/>
                     </a:xfrm>
                     <a:prstGeom prst="rect">
                       <a:avLst/>
@@ -229,76 +240,110 @@
           </wp:inline>
         </w:drawing>
       </w:r>
-      <w:r>
-        <w:br w:type="page"/>
-      </w:r>
+    </w:p>
+    <w:p>
+      <w:pPr>
+        <w:numPr>
+          <w:ilvl w:val="0"/>
+          <w:numId w:val="0"/>
+        </w:numPr>
+        <w:jc w:val="center"/>
+        <w:rPr>
+          <w:color w:val="5B6472"/>
+          <w:sz w:val="18"/>
+        </w:rPr>
+      </w:pPr>
       <w:r>
         <w:rPr>
-          <w:color w:val="1B2A4A"/>
+          <w:color w:val="5B6472"/>
+          <w:sz w:val="18"/>
         </w:rPr>
-        <w:t>1. Overview</w:t>
+        <w:t>Harbour Blue</w:t>
       </w:r>
     </w:p>
     <w:p>
       <w:pPr>
-        <w:spacing w:after="200"/>
-        <w:jc w:val="left"/>
+        <w:numPr>
+          <w:ilvl w:val="0"/>
+          <w:numId w:val="0"/>
+        </w:numPr>
+        <w:jc w:val="center"/>
       </w:pPr>
       <w:r>
-        <w:t>Aurora Visuals is a full-service creative studio specialising in photography, brand design, and motion. This proposal outlines the scope, schedule, and investment for a refreshed visual identity and launch campaign.</w:t>
+        <w:drawing>
+          <wp:inline>
+            <wp:extent cx="3810000" cy="2381250"/>
+            <wp:docPr id="100008" name="Photo: Violet Hour"/>
+            <wp:cNvGraphicFramePr>
+              <a:graphicFrameLocks xmlns:a="http://schemas.openxmlformats.org/drawingml/2006/main" noChangeAspect="1"/>
+            </wp:cNvGraphicFramePr>
+            <a:graphic xmlns:a="http://schemas.openxmlformats.org/drawingml/2006/main">
+              <a:graphicData uri="http://schemas.openxmlformats.org/drawingml/2006/picture">
+                <pic:pic xmlns:pic="http://schemas.openxmlformats.org/drawingml/2006/picture">
+                  <pic:nvPicPr>
+                    <pic:cNvPr id="100008" name=""/>
+                    <pic:cNvPicPr>
+                      <a:picLocks noChangeAspect="1"/>
+                    </pic:cNvPicPr>
+                  </pic:nvPicPr>
+                  <pic:blipFill>
+                    <a:blip xmlns:r="http://schemas.openxmlformats.org/officeDocument/2006/relationships" r:embed="rId6"/>
+                    <a:stretch>
+                      <a:fillRect/>
+                    </a:stretch>
+                  </pic:blipFill>
+                  <pic:spPr>
+                    <a:xfrm>
+                      <a:off x="0" y="0"/>
+                      <a:ext cx="3810000" cy="2381250"/>
+                    </a:xfrm>
+                    <a:prstGeom prst="rect">
+                      <a:avLst/>
+                    </a:prstGeom>
+                  </pic:spPr>
+                </pic:pic>
+              </a:graphicData>
+            </a:graphic>
+          </wp:inline>
+        </w:drawing>
       </w:r>
     </w:p>
     <w:p>
       <w:pPr>
         <w:numPr>
           <w:ilvl w:val="0"/>
-          <w:numId w:val="1"/>
+          <w:numId w:val="0"/>
         </w:numPr>
-        <w:spacing w:after="200"/>
-        <w:jc w:val="left"/>
+        <w:jc w:val="center"/>
+        <w:rPr>
+          <w:color w:val="5B6472"/>
+          <w:sz w:val="18"/>
+        </w:rPr>
       </w:pPr>
       <w:r>
-        <w:t>Full-service studio: photography, brand identity, and motion under one roof.</w:t>
+        <w:rPr>
+          <w:color w:val="5B6472"/>
+          <w:sz w:val="18"/>
+        </w:rPr>
+        <w:t>Violet Hour</w:t>
       </w:r>
     </w:p>
     <w:p>
       <w:pPr>
         <w:numPr>
           <w:ilvl w:val="0"/>
-          <w:numId w:val="1"/>
+          <w:numId w:val="0"/>
         </w:numPr>
-        <w:spacing w:after="200"/>
         <w:jc w:val="left"/>
-      </w:pPr>
-      <w:r>
-        <w:t>Senior creative leads on every engagement — no hand-offs to juniors.</w:t>
-      </w:r>
-    </w:p>
-    <w:p>
-      <w:pPr>
-        <w:numPr>
-          <w:ilvl w:val="0"/>
-          <w:numId w:val="1"/>
-        </w:numPr>
-        <w:spacing w:after="200"/>
-        <w:jc w:val="left"/>
-      </w:pPr>
-      <w:r>
-        <w:t>Licensed, watermark-protected delivery so client assets stay controlled.</w:t>
-      </w:r>
-    </w:p>
-    <w:p>
-      <w:pPr>
-        <w:numPr>
-          <w:ilvl w:val="0"/>
-          <w:numId w:val="1"/>
-        </w:numPr>
-        <w:spacing w:after="200"/>
-        <w:jc w:val="left"/>
-      </w:pPr>
-      <w:r>
-        <w:t>Average 12-day turnaround from brief to final delivery.</w:t>
-      </w:r>
+        <w:sectPr>
+          <w:headerReference w:type="default" r:id="rId7"/>
+          <w:footerReference w:type="default" r:id="rId8"/>
+          <w:pgSz w:w="12240" w:h="15840"/>
+          <w:pgMar w:top="1440" w:right="1440" w:bottom="1440" w:left="1440" w:header="720" w:footer="720" w:gutter="0"/>
+          <w:cols w:space="720"/>
+          <w:docGrid w:linePitch="360"/>
+        </w:sectPr>
+      </w:pPr>
     </w:p>
     <w:p>
       <w:pPr>
@@ -307,7 +352,6 @@
           <w:ilvl w:val="0"/>
           <w:numId w:val="0"/>
         </w:numPr>
-        <w:spacing w:after="200"/>
         <w:jc w:val="left"/>
         <w:rPr>
           <w:color w:val="1B2A4A"/>
@@ -317,7 +361,7 @@
         <w:rPr>
           <w:color w:val="1B2A4A"/>
         </w:rPr>
-        <w:t>2. Services</w:t>
+        <w:t>Campaign results</w:t>
       </w:r>
     </w:p>
     <w:p>
@@ -326,11 +370,10 @@
           <w:ilvl w:val="0"/>
           <w:numId w:val="0"/>
         </w:numPr>
-        <w:spacing w:after="200"/>
         <w:jc w:val="left"/>
       </w:pPr>
       <w:r>
-        <w:t>The engagement draws on the following studio services. Rates are fixed for the duration of the project.</w:t>
+        <w:t>Results by channel over the six-week launch window:</w:t>
       </w:r>
     </w:p>
     <w:tbl>
@@ -351,10 +394,10 @@
         </w:tblCellMar>
       </w:tblPr>
       <w:tblGrid>
-        <w:gridCol w:w="1720"/>
-        <w:gridCol w:w="4520"/>
-        <w:gridCol w:w="1961"/>
-        <w:gridCol w:w="1130"/>
+        <w:gridCol w:w="2624"/>
+        <w:gridCol w:w="1673"/>
+        <w:gridCol w:w="2507"/>
+        <w:gridCol w:w="2526"/>
       </w:tblGrid>
       <w:tr>
         <w:tblPrEx>
@@ -372,7 +415,6 @@
                 <w:ilvl w:val="0"/>
                 <w:numId w:val="0"/>
               </w:numPr>
-              <w:spacing w:after="200"/>
               <w:jc w:val="left"/>
               <w:rPr>
                 <w:b/>
@@ -384,7 +426,7 @@
                 <w:b/>
                 <w:color w:val="FFFFFF"/>
               </w:rPr>
-              <w:t>SKU</w:t>
+              <w:t>Channel</w:t>
             </w:r>
           </w:p>
         </w:tc>
@@ -399,7 +441,6 @@
                 <w:ilvl w:val="0"/>
                 <w:numId w:val="0"/>
               </w:numPr>
-              <w:spacing w:after="200"/>
               <w:jc w:val="left"/>
               <w:rPr>
                 <w:b/>
@@ -411,7 +452,7 @@
                 <w:b/>
                 <w:color w:val="FFFFFF"/>
               </w:rPr>
-              <w:t>Service</w:t>
+              <w:t>Reach</w:t>
             </w:r>
           </w:p>
         </w:tc>
@@ -426,7 +467,6 @@
                 <w:ilvl w:val="0"/>
                 <w:numId w:val="0"/>
               </w:numPr>
-              <w:spacing w:after="200"/>
               <w:jc w:val="left"/>
               <w:rPr>
                 <w:b/>
@@ -438,7 +478,7 @@
                 <w:b/>
                 <w:color w:val="FFFFFF"/>
               </w:rPr>
-              <w:t>Category</w:t>
+              <w:t>Engagement</w:t>
             </w:r>
           </w:p>
         </w:tc>
@@ -453,7 +493,6 @@
                 <w:ilvl w:val="0"/>
                 <w:numId w:val="0"/>
               </w:numPr>
-              <w:spacing w:after="200"/>
               <w:jc w:val="left"/>
             </w:pPr>
             <w:r>
@@ -461,7 +500,7 @@
                 <w:b/>
                 <w:color w:val="FFFFFF"/>
               </w:rPr>
-              <w:t>Rate</w:t>
+              <w:t>Conversions</w:t>
             </w:r>
           </w:p>
         </w:tc>
@@ -482,11 +521,10 @@
                 <w:ilvl w:val="0"/>
                 <w:numId w:val="0"/>
               </w:numPr>
-              <w:spacing w:after="200"/>
-              <w:jc w:val="left"/>
-            </w:pPr>
-            <w:r>
-              <w:t>AV-PH-01</w:t>
+              <w:jc w:val="left"/>
+            </w:pPr>
+            <w:r>
+              <w:t>Paid social</w:t>
             </w:r>
           </w:p>
         </w:tc>
@@ -501,11 +539,10 @@
                 <w:ilvl w:val="0"/>
                 <w:numId w:val="0"/>
               </w:numPr>
-              <w:spacing w:after="200"/>
-              <w:jc w:val="left"/>
-            </w:pPr>
-            <w:r>
-              <w:t>Studio photography (half day)</w:t>
+              <w:jc w:val="left"/>
+            </w:pPr>
+            <w:r>
+              <w:t>920,000</w:t>
             </w:r>
           </w:p>
         </w:tc>
@@ -520,11 +557,10 @@
                 <w:ilvl w:val="0"/>
                 <w:numId w:val="0"/>
               </w:numPr>
-              <w:spacing w:after="200"/>
-              <w:jc w:val="left"/>
-            </w:pPr>
-            <w:r>
-              <w:t>Photography</w:t>
+              <w:jc w:val="left"/>
+            </w:pPr>
+            <w:r>
+              <w:t>4.8%</w:t>
             </w:r>
           </w:p>
         </w:tc>
@@ -539,11 +575,10 @@
                 <w:ilvl w:val="0"/>
                 <w:numId w:val="0"/>
               </w:numPr>
-              <w:spacing w:after="200"/>
-              <w:jc w:val="left"/>
-            </w:pPr>
-            <w:r>
-              <w:t>$1,200</w:t>
+              <w:jc w:val="left"/>
+            </w:pPr>
+            <w:r>
+              <w:t>6,100</w:t>
             </w:r>
           </w:p>
         </w:tc>
@@ -564,11 +599,10 @@
                 <w:ilvl w:val="0"/>
                 <w:numId w:val="0"/>
               </w:numPr>
-              <w:spacing w:after="200"/>
-              <w:jc w:val="left"/>
-            </w:pPr>
-            <w:r>
-              <w:t>AV-PH-02</w:t>
+              <w:jc w:val="left"/>
+            </w:pPr>
+            <w:r>
+              <w:t>Organic social</w:t>
             </w:r>
           </w:p>
         </w:tc>
@@ -583,11 +617,10 @@
                 <w:ilvl w:val="0"/>
                 <w:numId w:val="0"/>
               </w:numPr>
-              <w:spacing w:after="200"/>
-              <w:jc w:val="left"/>
-            </w:pPr>
-            <w:r>
-              <w:t>On-location photography (full day)</w:t>
+              <w:jc w:val="left"/>
+            </w:pPr>
+            <w:r>
+              <w:t>610,000</w:t>
             </w:r>
           </w:p>
         </w:tc>
@@ -602,11 +635,10 @@
                 <w:ilvl w:val="0"/>
                 <w:numId w:val="0"/>
               </w:numPr>
-              <w:spacing w:after="200"/>
-              <w:jc w:val="left"/>
-            </w:pPr>
-            <w:r>
-              <w:t>Photography</w:t>
+              <w:jc w:val="left"/>
+            </w:pPr>
+            <w:r>
+              <w:t>6.2%</w:t>
             </w:r>
           </w:p>
         </w:tc>
@@ -621,11 +653,10 @@
                 <w:ilvl w:val="0"/>
                 <w:numId w:val="0"/>
               </w:numPr>
-              <w:spacing w:after="200"/>
-              <w:jc w:val="left"/>
-            </w:pPr>
-            <w:r>
-              <w:t>$2,600</w:t>
+              <w:jc w:val="left"/>
+            </w:pPr>
+            <w:r>
+              <w:t>3,400</w:t>
             </w:r>
           </w:p>
         </w:tc>
@@ -646,11 +677,10 @@
                 <w:ilvl w:val="0"/>
                 <w:numId w:val="0"/>
               </w:numPr>
-              <w:spacing w:after="200"/>
-              <w:jc w:val="left"/>
-            </w:pPr>
-            <w:r>
-              <w:t>AV-BR-01</w:t>
+              <w:jc w:val="left"/>
+            </w:pPr>
+            <w:r>
+              <w:t>Out-of-home</w:t>
             </w:r>
           </w:p>
         </w:tc>
@@ -665,11 +695,10 @@
                 <w:ilvl w:val="0"/>
                 <w:numId w:val="0"/>
               </w:numPr>
-              <w:spacing w:after="200"/>
-              <w:jc w:val="left"/>
-            </w:pPr>
-            <w:r>
-              <w:t>Brand identity system</w:t>
+              <w:jc w:val="left"/>
+            </w:pPr>
+            <w:r>
+              <w:t>240,000</w:t>
             </w:r>
           </w:p>
         </w:tc>
@@ -684,11 +713,10 @@
                 <w:ilvl w:val="0"/>
                 <w:numId w:val="0"/>
               </w:numPr>
-              <w:spacing w:after="200"/>
-              <w:jc w:val="left"/>
-            </w:pPr>
-            <w:r>
-              <w:t>Brand Design</w:t>
+              <w:jc w:val="left"/>
+            </w:pPr>
+            <w:r>
+              <w:t>—</w:t>
             </w:r>
           </w:p>
         </w:tc>
@@ -703,11 +731,10 @@
                 <w:ilvl w:val="0"/>
                 <w:numId w:val="0"/>
               </w:numPr>
-              <w:spacing w:after="200"/>
-              <w:jc w:val="left"/>
-            </w:pPr>
-            <w:r>
-              <w:t>$8,500</w:t>
+              <w:jc w:val="left"/>
+            </w:pPr>
+            <w:r>
+              <w:t>1,150</w:t>
             </w:r>
           </w:p>
         </w:tc>
@@ -728,11 +755,10 @@
                 <w:ilvl w:val="0"/>
                 <w:numId w:val="0"/>
               </w:numPr>
-              <w:spacing w:after="200"/>
-              <w:jc w:val="left"/>
-            </w:pPr>
-            <w:r>
-              <w:t>AV-BR-02</w:t>
+              <w:jc w:val="left"/>
+            </w:pPr>
+            <w:r>
+              <w:t>In-store</w:t>
             </w:r>
           </w:p>
         </w:tc>
@@ -747,11 +773,10 @@
                 <w:ilvl w:val="0"/>
                 <w:numId w:val="0"/>
               </w:numPr>
-              <w:spacing w:after="200"/>
-              <w:jc w:val="left"/>
-            </w:pPr>
-            <w:r>
-              <w:t>Pitch &amp; sales deck design</w:t>
+              <w:jc w:val="left"/>
+            </w:pPr>
+            <w:r>
+              <w:t>38,000</w:t>
             </w:r>
           </w:p>
         </w:tc>
@@ -766,11 +791,10 @@
                 <w:ilvl w:val="0"/>
                 <w:numId w:val="0"/>
               </w:numPr>
-              <w:spacing w:after="200"/>
-              <w:jc w:val="left"/>
-            </w:pPr>
-            <w:r>
-              <w:t>Brand Design</w:t>
+              <w:jc w:val="left"/>
+            </w:pPr>
+            <w:r>
+              <w:t>—</w:t>
             </w:r>
           </w:p>
         </w:tc>
@@ -785,175 +809,10 @@
                 <w:ilvl w:val="0"/>
                 <w:numId w:val="0"/>
               </w:numPr>
-              <w:spacing w:after="200"/>
-              <w:jc w:val="left"/>
-            </w:pPr>
-            <w:r>
-              <w:t>$3,400</w:t>
-            </w:r>
-          </w:p>
-        </w:tc>
-      </w:tr>
-      <w:tr>
-        <w:tblPrEx>
-          <w:tblW w:w="5000" w:type="pct"/>
-          <w:tblInd w:w="0" w:type="dxa"/>
-        </w:tblPrEx>
-        <w:tc>
-          <w:tcPr>
-            <w:shd w:val="clear" w:color="auto" w:fill="FFFFFF"/>
-            <w:vAlign w:val="center"/>
-          </w:tcPr>
-          <w:p>
-            <w:pPr>
-              <w:numPr>
-                <w:ilvl w:val="0"/>
-                <w:numId w:val="0"/>
-              </w:numPr>
-              <w:spacing w:after="200"/>
-              <w:jc w:val="left"/>
-            </w:pPr>
-            <w:r>
-              <w:t>AV-MO-01</w:t>
-            </w:r>
-          </w:p>
-        </w:tc>
-        <w:tc>
-          <w:tcPr>
-            <w:shd w:val="clear" w:color="auto" w:fill="FFFFFF"/>
-            <w:vAlign w:val="center"/>
-          </w:tcPr>
-          <w:p>
-            <w:pPr>
-              <w:numPr>
-                <w:ilvl w:val="0"/>
-                <w:numId w:val="0"/>
-              </w:numPr>
-              <w:spacing w:after="200"/>
-              <w:jc w:val="left"/>
-            </w:pPr>
-            <w:r>
-              <w:t>Social motion pack (10 clips)</w:t>
-            </w:r>
-          </w:p>
-        </w:tc>
-        <w:tc>
-          <w:tcPr>
-            <w:shd w:val="clear" w:color="auto" w:fill="FFFFFF"/>
-            <w:vAlign w:val="center"/>
-          </w:tcPr>
-          <w:p>
-            <w:pPr>
-              <w:numPr>
-                <w:ilvl w:val="0"/>
-                <w:numId w:val="0"/>
-              </w:numPr>
-              <w:spacing w:after="200"/>
-              <w:jc w:val="left"/>
-            </w:pPr>
-            <w:r>
-              <w:t>Motion</w:t>
-            </w:r>
-          </w:p>
-        </w:tc>
-        <w:tc>
-          <w:tcPr>
-            <w:shd w:val="clear" w:color="auto" w:fill="FFFFFF"/>
-            <w:vAlign w:val="center"/>
-          </w:tcPr>
-          <w:p>
-            <w:pPr>
-              <w:numPr>
-                <w:ilvl w:val="0"/>
-                <w:numId w:val="0"/>
-              </w:numPr>
-              <w:spacing w:after="200"/>
-              <w:jc w:val="left"/>
-            </w:pPr>
-            <w:r>
-              <w:t>$4,200</w:t>
-            </w:r>
-          </w:p>
-        </w:tc>
-      </w:tr>
-      <w:tr>
-        <w:tblPrEx>
-          <w:tblW w:w="5000" w:type="pct"/>
-          <w:tblInd w:w="0" w:type="dxa"/>
-        </w:tblPrEx>
-        <w:tc>
-          <w:tcPr>
-            <w:shd w:val="clear" w:color="auto" w:fill="F4F6FA"/>
-            <w:vAlign w:val="center"/>
-          </w:tcPr>
-          <w:p>
-            <w:pPr>
-              <w:numPr>
-                <w:ilvl w:val="0"/>
-                <w:numId w:val="0"/>
-              </w:numPr>
-              <w:spacing w:after="200"/>
-              <w:jc w:val="left"/>
-            </w:pPr>
-            <w:r>
-              <w:t>AV-MO-02</w:t>
-            </w:r>
-          </w:p>
-        </w:tc>
-        <w:tc>
-          <w:tcPr>
-            <w:shd w:val="clear" w:color="auto" w:fill="F4F6FA"/>
-            <w:vAlign w:val="center"/>
-          </w:tcPr>
-          <w:p>
-            <w:pPr>
-              <w:numPr>
-                <w:ilvl w:val="0"/>
-                <w:numId w:val="0"/>
-              </w:numPr>
-              <w:spacing w:after="200"/>
-              <w:jc w:val="left"/>
-            </w:pPr>
-            <w:r>
-              <w:t>Brand film (60s)</w:t>
-            </w:r>
-          </w:p>
-        </w:tc>
-        <w:tc>
-          <w:tcPr>
-            <w:shd w:val="clear" w:color="auto" w:fill="F4F6FA"/>
-            <w:vAlign w:val="center"/>
-          </w:tcPr>
-          <w:p>
-            <w:pPr>
-              <w:numPr>
-                <w:ilvl w:val="0"/>
-                <w:numId w:val="0"/>
-              </w:numPr>
-              <w:spacing w:after="200"/>
-              <w:jc w:val="left"/>
-            </w:pPr>
-            <w:r>
-              <w:t>Motion</w:t>
-            </w:r>
-          </w:p>
-        </w:tc>
-        <w:tc>
-          <w:tcPr>
-            <w:shd w:val="clear" w:color="auto" w:fill="F4F6FA"/>
-            <w:vAlign w:val="center"/>
-          </w:tcPr>
-          <w:p>
-            <w:pPr>
-              <w:numPr>
-                <w:ilvl w:val="0"/>
-                <w:numId w:val="0"/>
-              </w:numPr>
-              <w:spacing w:after="200"/>
-              <w:jc w:val="left"/>
-            </w:pPr>
-            <w:r>
-              <w:t>$9,800</w:t>
+              <w:jc w:val="left"/>
+            </w:pPr>
+            <w:r>
+              <w:t>4,700</w:t>
             </w:r>
           </w:p>
         </w:tc>
@@ -965,9 +824,55 @@
           <w:ilvl w:val="0"/>
           <w:numId w:val="0"/>
         </w:numPr>
-        <w:spacing w:after="200"/>
         <w:jc w:val="left"/>
       </w:pPr>
+    </w:p>
+    <w:p>
+      <w:pPr>
+        <w:numPr>
+          <w:ilvl w:val="0"/>
+          <w:numId w:val="0"/>
+        </w:numPr>
+        <w:jc w:val="center"/>
+      </w:pPr>
+      <w:r>
+        <w:drawing>
+          <wp:inline>
+            <wp:extent cx="4572000" cy="2857500"/>
+            <wp:docPr id="100010" name="Photo: Ember Ridge"/>
+            <wp:cNvGraphicFramePr>
+              <a:graphicFrameLocks xmlns:a="http://schemas.openxmlformats.org/drawingml/2006/main" noChangeAspect="1"/>
+            </wp:cNvGraphicFramePr>
+            <a:graphic xmlns:a="http://schemas.openxmlformats.org/drawingml/2006/main">
+              <a:graphicData uri="http://schemas.openxmlformats.org/drawingml/2006/picture">
+                <pic:pic xmlns:pic="http://schemas.openxmlformats.org/drawingml/2006/picture">
+                  <pic:nvPicPr>
+                    <pic:cNvPr id="100010" name=""/>
+                    <pic:cNvPicPr>
+                      <a:picLocks noChangeAspect="1"/>
+                    </pic:cNvPicPr>
+                  </pic:nvPicPr>
+                  <pic:blipFill>
+                    <a:blip xmlns:r="http://schemas.openxmlformats.org/officeDocument/2006/relationships" r:embed="rId9"/>
+                    <a:stretch>
+                      <a:fillRect/>
+                    </a:stretch>
+                  </pic:blipFill>
+                  <pic:spPr>
+                    <a:xfrm>
+                      <a:off x="0" y="0"/>
+                      <a:ext cx="4572000" cy="2857500"/>
+                    </a:xfrm>
+                    <a:prstGeom prst="rect">
+                      <a:avLst/>
+                    </a:prstGeom>
+                  </pic:spPr>
+                </pic:pic>
+              </a:graphicData>
+            </a:graphic>
+          </wp:inline>
+        </w:drawing>
+      </w:r>
     </w:p>
     <w:p>
       <w:pPr>
@@ -976,17 +881,19 @@
           <w:ilvl w:val="0"/>
           <w:numId w:val="0"/>
         </w:numPr>
-        <w:spacing w:after="200"/>
         <w:jc w:val="left"/>
         <w:rPr>
           <w:color w:val="1B2A4A"/>
         </w:rPr>
       </w:pPr>
       <w:r>
+        <w:br w:type="page"/>
+      </w:r>
+      <w:r>
         <w:rPr>
           <w:color w:val="1B2A4A"/>
         </w:rPr>
-        <w:t>3. Timeline</w:t>
+        <w:t>Lessons learned</w:t>
       </w:r>
     </w:p>
     <w:p>
@@ -995,11 +902,10 @@
           <w:ilvl w:val="0"/>
           <w:numId w:val="2"/>
         </w:numPr>
-        <w:spacing w:after="200"/>
         <w:jc w:val="left"/>
       </w:pPr>
       <w:r>
-        <w:t>Week 1 — Discovery workshop and creative brief.</w:t>
+        <w:t>Lock watermarks on review drafts: unlocked marks were cropped out of two leaked previews.</w:t>
       </w:r>
     </w:p>
     <w:p>
@@ -1008,11 +914,10 @@
           <w:ilvl w:val="0"/>
           <w:numId w:val="2"/>
         </w:numPr>
-        <w:spacing w:after="200"/>
         <w:jc w:val="left"/>
       </w:pPr>
       <w:r>
-        <w:t>Week 2 — Studio and on-location photography.</w:t>
+        <w:t>Approve hero frames before motion starts; it saved a week of re-edits.</w:t>
       </w:r>
     </w:p>
     <w:p>
@@ -1021,38 +926,29 @@
           <w:ilvl w:val="0"/>
           <w:numId w:val="2"/>
         </w:numPr>
-        <w:spacing w:after="200"/>
         <w:jc w:val="left"/>
       </w:pPr>
       <w:r>
-        <w:t>Week 3 — Brand system and pitch-deck design.</w:t>
+        <w:t>Keep one master rate card so every estimate matches the signed proposal.</w:t>
       </w:r>
     </w:p>
     <w:p>
       <w:pPr>
         <w:numPr>
           <w:ilvl w:val="0"/>
-          <w:numId w:val="2"/>
+          <w:numId w:val="0"/>
         </w:numPr>
-        <w:spacing w:after="200"/>
         <w:jc w:val="left"/>
-      </w:pPr>
-      <w:r>
-        <w:t>Week 4 — Motion pack production.</w:t>
-      </w:r>
-    </w:p>
-    <w:p>
-      <w:pPr>
-        <w:numPr>
-          <w:ilvl w:val="0"/>
-          <w:numId w:val="2"/>
-        </w:numPr>
-        <w:spacing w:after="200"/>
-        <w:jc w:val="left"/>
-      </w:pPr>
-      <w:r>
-        <w:t>Week 5 — Review, revisions, and watermark-protected delivery.</w:t>
-      </w:r>
+        <w:sectPr>
+          <w:headerReference w:type="default" r:id="rId10"/>
+          <w:footerReference w:type="default" r:id="rId11"/>
+          <w:type w:val="nextPage"/>
+          <w:pgSz w:w="12240" w:h="15840"/>
+          <w:pgMar w:top="1440" w:right="1440" w:bottom="1440" w:left="1440" w:header="720" w:footer="720" w:gutter="0"/>
+          <w:cols w:space="720"/>
+          <w:docGrid w:linePitch="360"/>
+        </w:sectPr>
+      </w:pPr>
     </w:p>
     <w:p>
       <w:pPr>
@@ -1061,7 +957,6 @@
           <w:ilvl w:val="0"/>
           <w:numId w:val="0"/>
         </w:numPr>
-        <w:spacing w:after="200"/>
         <w:jc w:val="left"/>
         <w:rPr>
           <w:color w:val="1B2A4A"/>
@@ -1071,20 +966,7 @@
         <w:rPr>
           <w:color w:val="1B2A4A"/>
         </w:rPr>
-        <w:t>4. Investment</w:t>
-      </w:r>
-    </w:p>
-    <w:p>
-      <w:pPr>
-        <w:numPr>
-          <w:ilvl w:val="0"/>
-          <w:numId w:val="0"/>
-        </w:numPr>
-        <w:spacing w:after="200"/>
-        <w:jc w:val="left"/>
-      </w:pPr>
-      <w:r>
-        <w:t>A summary of the fixed-fee investment by phase:</w:t>
+        <w:t>Appendix — Rate card</w:t>
       </w:r>
     </w:p>
     <w:tbl>
@@ -1105,9 +987,10 @@
         </w:tblCellMar>
       </w:tblPr>
       <w:tblGrid>
-        <w:gridCol w:w="2571"/>
-        <w:gridCol w:w="5022"/>
-        <w:gridCol w:w="1737"/>
+        <w:gridCol w:w="2269"/>
+        <w:gridCol w:w="6249"/>
+        <w:gridCol w:w="2783"/>
+        <w:gridCol w:w="1628"/>
       </w:tblGrid>
       <w:tr>
         <w:tblPrEx>
@@ -1125,7 +1008,6 @@
                 <w:ilvl w:val="0"/>
                 <w:numId w:val="0"/>
               </w:numPr>
-              <w:spacing w:after="200"/>
               <w:jc w:val="left"/>
               <w:rPr>
                 <w:b/>
@@ -1137,7 +1019,7 @@
                 <w:b/>
                 <w:color w:val="FFFFFF"/>
               </w:rPr>
-              <w:t>Phase</w:t>
+              <w:t>SKU</w:t>
             </w:r>
           </w:p>
         </w:tc>
@@ -1152,7 +1034,6 @@
                 <w:ilvl w:val="0"/>
                 <w:numId w:val="0"/>
               </w:numPr>
-              <w:spacing w:after="200"/>
               <w:jc w:val="left"/>
               <w:rPr>
                 <w:b/>
@@ -1164,7 +1045,7 @@
                 <w:b/>
                 <w:color w:val="FFFFFF"/>
               </w:rPr>
-              <w:t>Deliverable</w:t>
+              <w:t>Service</w:t>
             </w:r>
           </w:p>
         </w:tc>
@@ -1179,15 +1060,40 @@
                 <w:ilvl w:val="0"/>
                 <w:numId w:val="0"/>
               </w:numPr>
-              <w:spacing w:after="200"/>
-              <w:jc w:val="left"/>
-            </w:pPr>
-            <w:r>
+              <w:jc w:val="left"/>
               <w:rPr>
                 <w:b/>
                 <w:color w:val="FFFFFF"/>
               </w:rPr>
-              <w:t>Fee</w:t>
+            </w:pPr>
+            <w:r>
+              <w:rPr>
+                <w:b/>
+                <w:color w:val="FFFFFF"/>
+              </w:rPr>
+              <w:t>Category</w:t>
+            </w:r>
+          </w:p>
+        </w:tc>
+        <w:tc>
+          <w:tcPr>
+            <w:shd w:val="clear" w:color="auto" w:fill="1B2A4A"/>
+            <w:vAlign w:val="center"/>
+          </w:tcPr>
+          <w:p>
+            <w:pPr>
+              <w:numPr>
+                <w:ilvl w:val="0"/>
+                <w:numId w:val="0"/>
+              </w:numPr>
+              <w:jc w:val="left"/>
+            </w:pPr>
+            <w:r>
+              <w:rPr>
+                <w:b/>
+                <w:color w:val="FFFFFF"/>
+              </w:rPr>
+              <w:t>Rate</w:t>
             </w:r>
           </w:p>
         </w:tc>
@@ -1208,7 +1114,42 @@
                 <w:ilvl w:val="0"/>
                 <w:numId w:val="0"/>
               </w:numPr>
-              <w:spacing w:after="200"/>
+              <w:jc w:val="left"/>
+            </w:pPr>
+            <w:r>
+              <w:t>AV-PH-01</w:t>
+            </w:r>
+          </w:p>
+        </w:tc>
+        <w:tc>
+          <w:tcPr>
+            <w:shd w:val="clear" w:color="auto" w:fill="FFFFFF"/>
+            <w:vAlign w:val="center"/>
+          </w:tcPr>
+          <w:p>
+            <w:pPr>
+              <w:numPr>
+                <w:ilvl w:val="0"/>
+                <w:numId w:val="0"/>
+              </w:numPr>
+              <w:jc w:val="left"/>
+            </w:pPr>
+            <w:r>
+              <w:t>Studio photography (half day)</w:t>
+            </w:r>
+          </w:p>
+        </w:tc>
+        <w:tc>
+          <w:tcPr>
+            <w:shd w:val="clear" w:color="auto" w:fill="FFFFFF"/>
+            <w:vAlign w:val="center"/>
+          </w:tcPr>
+          <w:p>
+            <w:pPr>
+              <w:numPr>
+                <w:ilvl w:val="0"/>
+                <w:numId w:val="0"/>
+              </w:numPr>
               <w:jc w:val="left"/>
             </w:pPr>
             <w:r>
@@ -1227,30 +1168,10 @@
                 <w:ilvl w:val="0"/>
                 <w:numId w:val="0"/>
               </w:numPr>
-              <w:spacing w:after="200"/>
-              <w:jc w:val="left"/>
-            </w:pPr>
-            <w:r>
-              <w:t>Studio + on-location shoot</w:t>
-            </w:r>
-          </w:p>
-        </w:tc>
-        <w:tc>
-          <w:tcPr>
-            <w:shd w:val="clear" w:color="auto" w:fill="FFFFFF"/>
-            <w:vAlign w:val="center"/>
-          </w:tcPr>
-          <w:p>
-            <w:pPr>
-              <w:numPr>
-                <w:ilvl w:val="0"/>
-                <w:numId w:val="0"/>
-              </w:numPr>
-              <w:spacing w:after="200"/>
-              <w:jc w:val="left"/>
-            </w:pPr>
-            <w:r>
-              <w:t>$3,800</w:t>
+              <w:jc w:val="left"/>
+            </w:pPr>
+            <w:r>
+              <w:t>$1,200</w:t>
             </w:r>
           </w:p>
         </w:tc>
@@ -1271,11 +1192,10 @@
                 <w:ilvl w:val="0"/>
                 <w:numId w:val="0"/>
               </w:numPr>
-              <w:spacing w:after="200"/>
-              <w:jc w:val="left"/>
-            </w:pPr>
-            <w:r>
-              <w:t>Brand design</w:t>
+              <w:jc w:val="left"/>
+            </w:pPr>
+            <w:r>
+              <w:t>AV-PH-02</w:t>
             </w:r>
           </w:p>
         </w:tc>
@@ -1290,11 +1210,10 @@
                 <w:ilvl w:val="0"/>
                 <w:numId w:val="0"/>
               </w:numPr>
-              <w:spacing w:after="200"/>
-              <w:jc w:val="left"/>
-            </w:pPr>
-            <w:r>
-              <w:t>Identity system + pitch deck</w:t>
+              <w:jc w:val="left"/>
+            </w:pPr>
+            <w:r>
+              <w:t>On-location photography (full day)</w:t>
             </w:r>
           </w:p>
         </w:tc>
@@ -1309,11 +1228,28 @@
                 <w:ilvl w:val="0"/>
                 <w:numId w:val="0"/>
               </w:numPr>
-              <w:spacing w:after="200"/>
-              <w:jc w:val="left"/>
-            </w:pPr>
-            <w:r>
-              <w:t>$11,900</w:t>
+              <w:jc w:val="left"/>
+            </w:pPr>
+            <w:r>
+              <w:t>Photography</w:t>
+            </w:r>
+          </w:p>
+        </w:tc>
+        <w:tc>
+          <w:tcPr>
+            <w:shd w:val="clear" w:color="auto" w:fill="F4F6FA"/>
+            <w:vAlign w:val="center"/>
+          </w:tcPr>
+          <w:p>
+            <w:pPr>
+              <w:numPr>
+                <w:ilvl w:val="0"/>
+                <w:numId w:val="0"/>
+              </w:numPr>
+              <w:jc w:val="left"/>
+            </w:pPr>
+            <w:r>
+              <w:t>$2,600</w:t>
             </w:r>
           </w:p>
         </w:tc>
@@ -1334,11 +1270,10 @@
                 <w:ilvl w:val="0"/>
                 <w:numId w:val="0"/>
               </w:numPr>
-              <w:spacing w:after="200"/>
-              <w:jc w:val="left"/>
-            </w:pPr>
-            <w:r>
-              <w:t>Motion</w:t>
+              <w:jc w:val="left"/>
+            </w:pPr>
+            <w:r>
+              <w:t>AV-BR-01</w:t>
             </w:r>
           </w:p>
         </w:tc>
@@ -1353,11 +1288,10 @@
                 <w:ilvl w:val="0"/>
                 <w:numId w:val="0"/>
               </w:numPr>
-              <w:spacing w:after="200"/>
-              <w:jc w:val="left"/>
-            </w:pPr>
-            <w:r>
-              <w:t>Social pack + brand film</w:t>
+              <w:jc w:val="left"/>
+            </w:pPr>
+            <w:r>
+              <w:t>Brand identity system</w:t>
             </w:r>
           </w:p>
         </w:tc>
@@ -1372,11 +1306,28 @@
                 <w:ilvl w:val="0"/>
                 <w:numId w:val="0"/>
               </w:numPr>
-              <w:spacing w:after="200"/>
-              <w:jc w:val="left"/>
-            </w:pPr>
-            <w:r>
-              <w:t>$14,000</w:t>
+              <w:jc w:val="left"/>
+            </w:pPr>
+            <w:r>
+              <w:t>Brand Design</w:t>
+            </w:r>
+          </w:p>
+        </w:tc>
+        <w:tc>
+          <w:tcPr>
+            <w:shd w:val="clear" w:color="auto" w:fill="FFFFFF"/>
+            <w:vAlign w:val="center"/>
+          </w:tcPr>
+          <w:p>
+            <w:pPr>
+              <w:numPr>
+                <w:ilvl w:val="0"/>
+                <w:numId w:val="0"/>
+              </w:numPr>
+              <w:jc w:val="left"/>
+            </w:pPr>
+            <w:r>
+              <w:t>$8,500</w:t>
             </w:r>
           </w:p>
         </w:tc>
@@ -1397,11 +1348,10 @@
                 <w:ilvl w:val="0"/>
                 <w:numId w:val="0"/>
               </w:numPr>
-              <w:spacing w:after="200"/>
-              <w:jc w:val="left"/>
-            </w:pPr>
-            <w:r>
-              <w:t>Total</w:t>
+              <w:jc w:val="left"/>
+            </w:pPr>
+            <w:r>
+              <w:t>AV-BR-02</w:t>
             </w:r>
           </w:p>
         </w:tc>
@@ -1416,11 +1366,10 @@
                 <w:ilvl w:val="0"/>
                 <w:numId w:val="0"/>
               </w:numPr>
-              <w:spacing w:after="200"/>
-              <w:jc w:val="left"/>
-            </w:pPr>
-            <w:r>
-              <w:t>Fixed project fee</w:t>
+              <w:jc w:val="left"/>
+            </w:pPr>
+            <w:r>
+              <w:t>Pitch &amp; sales deck design</w:t>
             </w:r>
           </w:p>
         </w:tc>
@@ -1435,11 +1384,184 @@
                 <w:ilvl w:val="0"/>
                 <w:numId w:val="0"/>
               </w:numPr>
-              <w:spacing w:after="200"/>
-              <w:jc w:val="left"/>
-            </w:pPr>
-            <w:r>
-              <w:t>$29,700</w:t>
+              <w:jc w:val="left"/>
+            </w:pPr>
+            <w:r>
+              <w:t>Brand Design</w:t>
+            </w:r>
+          </w:p>
+        </w:tc>
+        <w:tc>
+          <w:tcPr>
+            <w:shd w:val="clear" w:color="auto" w:fill="F4F6FA"/>
+            <w:vAlign w:val="center"/>
+          </w:tcPr>
+          <w:p>
+            <w:pPr>
+              <w:numPr>
+                <w:ilvl w:val="0"/>
+                <w:numId w:val="0"/>
+              </w:numPr>
+              <w:jc w:val="left"/>
+            </w:pPr>
+            <w:r>
+              <w:t>$3,400</w:t>
+            </w:r>
+          </w:p>
+        </w:tc>
+      </w:tr>
+      <w:tr>
+        <w:tblPrEx>
+          <w:tblW w:w="5000" w:type="pct"/>
+          <w:tblInd w:w="0" w:type="dxa"/>
+        </w:tblPrEx>
+        <w:tc>
+          <w:tcPr>
+            <w:shd w:val="clear" w:color="auto" w:fill="FFFFFF"/>
+            <w:vAlign w:val="center"/>
+          </w:tcPr>
+          <w:p>
+            <w:pPr>
+              <w:numPr>
+                <w:ilvl w:val="0"/>
+                <w:numId w:val="0"/>
+              </w:numPr>
+              <w:jc w:val="left"/>
+            </w:pPr>
+            <w:r>
+              <w:t>AV-MO-01</w:t>
+            </w:r>
+          </w:p>
+        </w:tc>
+        <w:tc>
+          <w:tcPr>
+            <w:shd w:val="clear" w:color="auto" w:fill="FFFFFF"/>
+            <w:vAlign w:val="center"/>
+          </w:tcPr>
+          <w:p>
+            <w:pPr>
+              <w:numPr>
+                <w:ilvl w:val="0"/>
+                <w:numId w:val="0"/>
+              </w:numPr>
+              <w:jc w:val="left"/>
+            </w:pPr>
+            <w:r>
+              <w:t>Social motion pack (10 clips)</w:t>
+            </w:r>
+          </w:p>
+        </w:tc>
+        <w:tc>
+          <w:tcPr>
+            <w:shd w:val="clear" w:color="auto" w:fill="FFFFFF"/>
+            <w:vAlign w:val="center"/>
+          </w:tcPr>
+          <w:p>
+            <w:pPr>
+              <w:numPr>
+                <w:ilvl w:val="0"/>
+                <w:numId w:val="0"/>
+              </w:numPr>
+              <w:jc w:val="left"/>
+            </w:pPr>
+            <w:r>
+              <w:t>Motion</w:t>
+            </w:r>
+          </w:p>
+        </w:tc>
+        <w:tc>
+          <w:tcPr>
+            <w:shd w:val="clear" w:color="auto" w:fill="FFFFFF"/>
+            <w:vAlign w:val="center"/>
+          </w:tcPr>
+          <w:p>
+            <w:pPr>
+              <w:numPr>
+                <w:ilvl w:val="0"/>
+                <w:numId w:val="0"/>
+              </w:numPr>
+              <w:jc w:val="left"/>
+            </w:pPr>
+            <w:r>
+              <w:t>$4,200</w:t>
+            </w:r>
+          </w:p>
+        </w:tc>
+      </w:tr>
+      <w:tr>
+        <w:tblPrEx>
+          <w:tblW w:w="5000" w:type="pct"/>
+          <w:tblInd w:w="0" w:type="dxa"/>
+        </w:tblPrEx>
+        <w:tc>
+          <w:tcPr>
+            <w:shd w:val="clear" w:color="auto" w:fill="F4F6FA"/>
+            <w:vAlign w:val="center"/>
+          </w:tcPr>
+          <w:p>
+            <w:pPr>
+              <w:numPr>
+                <w:ilvl w:val="0"/>
+                <w:numId w:val="0"/>
+              </w:numPr>
+              <w:jc w:val="left"/>
+            </w:pPr>
+            <w:r>
+              <w:t>AV-MO-02</w:t>
+            </w:r>
+          </w:p>
+        </w:tc>
+        <w:tc>
+          <w:tcPr>
+            <w:shd w:val="clear" w:color="auto" w:fill="F4F6FA"/>
+            <w:vAlign w:val="center"/>
+          </w:tcPr>
+          <w:p>
+            <w:pPr>
+              <w:numPr>
+                <w:ilvl w:val="0"/>
+                <w:numId w:val="0"/>
+              </w:numPr>
+              <w:jc w:val="left"/>
+            </w:pPr>
+            <w:r>
+              <w:t>Brand film (60s)</w:t>
+            </w:r>
+          </w:p>
+        </w:tc>
+        <w:tc>
+          <w:tcPr>
+            <w:shd w:val="clear" w:color="auto" w:fill="F4F6FA"/>
+            <w:vAlign w:val="center"/>
+          </w:tcPr>
+          <w:p>
+            <w:pPr>
+              <w:numPr>
+                <w:ilvl w:val="0"/>
+                <w:numId w:val="0"/>
+              </w:numPr>
+              <w:jc w:val="left"/>
+            </w:pPr>
+            <w:r>
+              <w:t>Motion</w:t>
+            </w:r>
+          </w:p>
+        </w:tc>
+        <w:tc>
+          <w:tcPr>
+            <w:shd w:val="clear" w:color="auto" w:fill="F4F6FA"/>
+            <w:vAlign w:val="center"/>
+          </w:tcPr>
+          <w:p>
+            <w:pPr>
+              <w:numPr>
+                <w:ilvl w:val="0"/>
+                <w:numId w:val="0"/>
+              </w:numPr>
+              <w:jc w:val="left"/>
+            </w:pPr>
+            <w:r>
+              <w:t>$9,800</w:t>
             </w:r>
           </w:p>
         </w:tc>
@@ -1447,12 +1569,20 @@
     </w:tbl>
     <w:p>
       <w:pPr>
-        <w:pStyle w:val="Heading1"/>
         <w:numPr>
           <w:ilvl w:val="0"/>
           <w:numId w:val="0"/>
         </w:numPr>
-        <w:spacing w:after="200"/>
+        <w:jc w:val="left"/>
+      </w:pPr>
+    </w:p>
+    <w:p>
+      <w:pPr>
+        <w:pStyle w:val="Heading2"/>
+        <w:numPr>
+          <w:ilvl w:val="0"/>
+          <w:numId w:val="0"/>
+        </w:numPr>
         <w:jc w:val="left"/>
         <w:rPr>
           <w:color w:val="1B2A4A"/>
@@ -1462,102 +1592,544 @@
         <w:rPr>
           <w:color w:val="1B2A4A"/>
         </w:rPr>
-        <w:t>5. Terms &amp; Resources</w:t>
+        <w:t>Appendix — Project budget</w:t>
       </w:r>
     </w:p>
+    <w:tbl>
+      <w:tblPr>
+        <w:tblW w:w="5000" w:type="pct"/>
+        <w:tblInd w:w="0" w:type="dxa"/>
+        <w:tblBorders>
+          <w:top w:val="single" w:sz="6" w:space="0" w:color="D8DEE8"/>
+          <w:left w:val="single" w:sz="6" w:space="0" w:color="D8DEE8"/>
+          <w:bottom w:val="single" w:sz="6" w:space="0" w:color="D8DEE8"/>
+          <w:right w:val="single" w:sz="6" w:space="0" w:color="D8DEE8"/>
+          <w:insideH w:val="single" w:sz="6" w:space="0" w:color="D8DEE8"/>
+          <w:insideV w:val="single" w:sz="6" w:space="0" w:color="D8DEE8"/>
+        </w:tblBorders>
+        <w:tblCellMar>
+          <w:left w:w="108" w:type="dxa"/>
+          <w:right w:w="108" w:type="dxa"/>
+        </w:tblCellMar>
+      </w:tblPr>
+      <w:tblGrid>
+        <w:gridCol w:w="4242"/>
+        <w:gridCol w:w="1889"/>
+        <w:gridCol w:w="2974"/>
+        <w:gridCol w:w="3826"/>
+      </w:tblGrid>
+      <w:tr>
+        <w:tblPrEx>
+          <w:tblW w:w="5000" w:type="pct"/>
+          <w:tblInd w:w="0" w:type="dxa"/>
+        </w:tblPrEx>
+        <w:tc>
+          <w:tcPr>
+            <w:shd w:val="clear" w:color="auto" w:fill="1B2A4A"/>
+            <w:vAlign w:val="center"/>
+          </w:tcPr>
+          <w:p>
+            <w:pPr>
+              <w:numPr>
+                <w:ilvl w:val="0"/>
+                <w:numId w:val="0"/>
+              </w:numPr>
+              <w:jc w:val="left"/>
+              <w:rPr>
+                <w:b/>
+                <w:color w:val="FFFFFF"/>
+              </w:rPr>
+            </w:pPr>
+            <w:r>
+              <w:rPr>
+                <w:b/>
+                <w:color w:val="FFFFFF"/>
+              </w:rPr>
+              <w:t>Phase</w:t>
+            </w:r>
+          </w:p>
+        </w:tc>
+        <w:tc>
+          <w:tcPr>
+            <w:shd w:val="clear" w:color="auto" w:fill="1B2A4A"/>
+            <w:vAlign w:val="center"/>
+          </w:tcPr>
+          <w:p>
+            <w:pPr>
+              <w:numPr>
+                <w:ilvl w:val="0"/>
+                <w:numId w:val="0"/>
+              </w:numPr>
+              <w:jc w:val="left"/>
+              <w:rPr>
+                <w:b/>
+                <w:color w:val="FFFFFF"/>
+              </w:rPr>
+            </w:pPr>
+            <w:r>
+              <w:rPr>
+                <w:b/>
+                <w:color w:val="FFFFFF"/>
+              </w:rPr>
+              <w:t>Hours</w:t>
+            </w:r>
+          </w:p>
+        </w:tc>
+        <w:tc>
+          <w:tcPr>
+            <w:shd w:val="clear" w:color="auto" w:fill="1B2A4A"/>
+            <w:vAlign w:val="center"/>
+          </w:tcPr>
+          <w:p>
+            <w:pPr>
+              <w:numPr>
+                <w:ilvl w:val="0"/>
+                <w:numId w:val="0"/>
+              </w:numPr>
+              <w:jc w:val="left"/>
+              <w:rPr>
+                <w:b/>
+                <w:color w:val="FFFFFF"/>
+              </w:rPr>
+            </w:pPr>
+            <w:r>
+              <w:rPr>
+                <w:b/>
+                <w:color w:val="FFFFFF"/>
+              </w:rPr>
+              <w:t>Rate (USD)</w:t>
+            </w:r>
+          </w:p>
+        </w:tc>
+        <w:tc>
+          <w:tcPr>
+            <w:shd w:val="clear" w:color="auto" w:fill="1B2A4A"/>
+            <w:vAlign w:val="center"/>
+          </w:tcPr>
+          <w:p>
+            <w:pPr>
+              <w:numPr>
+                <w:ilvl w:val="0"/>
+                <w:numId w:val="0"/>
+              </w:numPr>
+              <w:jc w:val="left"/>
+            </w:pPr>
+            <w:r>
+              <w:rPr>
+                <w:b/>
+                <w:color w:val="FFFFFF"/>
+              </w:rPr>
+              <w:t>Subtotal (USD)</w:t>
+            </w:r>
+          </w:p>
+        </w:tc>
+      </w:tr>
+      <w:tr>
+        <w:tblPrEx>
+          <w:tblW w:w="5000" w:type="pct"/>
+          <w:tblInd w:w="0" w:type="dxa"/>
+        </w:tblPrEx>
+        <w:tc>
+          <w:tcPr>
+            <w:shd w:val="clear" w:color="auto" w:fill="FFFFFF"/>
+            <w:vAlign w:val="center"/>
+          </w:tcPr>
+          <w:p>
+            <w:pPr>
+              <w:numPr>
+                <w:ilvl w:val="0"/>
+                <w:numId w:val="0"/>
+              </w:numPr>
+              <w:jc w:val="left"/>
+            </w:pPr>
+            <w:r>
+              <w:t>Discovery &amp; brief</w:t>
+            </w:r>
+          </w:p>
+        </w:tc>
+        <w:tc>
+          <w:tcPr>
+            <w:shd w:val="clear" w:color="auto" w:fill="FFFFFF"/>
+            <w:vAlign w:val="center"/>
+          </w:tcPr>
+          <w:p>
+            <w:pPr>
+              <w:numPr>
+                <w:ilvl w:val="0"/>
+                <w:numId w:val="0"/>
+              </w:numPr>
+              <w:jc w:val="left"/>
+            </w:pPr>
+            <w:r>
+              <w:t>16</w:t>
+            </w:r>
+          </w:p>
+        </w:tc>
+        <w:tc>
+          <w:tcPr>
+            <w:shd w:val="clear" w:color="auto" w:fill="FFFFFF"/>
+            <w:vAlign w:val="center"/>
+          </w:tcPr>
+          <w:p>
+            <w:pPr>
+              <w:numPr>
+                <w:ilvl w:val="0"/>
+                <w:numId w:val="0"/>
+              </w:numPr>
+              <w:jc w:val="left"/>
+            </w:pPr>
+            <w:r>
+              <w:t>$150</w:t>
+            </w:r>
+          </w:p>
+        </w:tc>
+        <w:tc>
+          <w:tcPr>
+            <w:shd w:val="clear" w:color="auto" w:fill="FFFFFF"/>
+            <w:vAlign w:val="center"/>
+          </w:tcPr>
+          <w:p>
+            <w:pPr>
+              <w:numPr>
+                <w:ilvl w:val="0"/>
+                <w:numId w:val="0"/>
+              </w:numPr>
+              <w:jc w:val="left"/>
+            </w:pPr>
+            <w:r>
+              <w:t>$2,400</w:t>
+            </w:r>
+          </w:p>
+        </w:tc>
+      </w:tr>
+      <w:tr>
+        <w:tblPrEx>
+          <w:tblW w:w="5000" w:type="pct"/>
+          <w:tblInd w:w="0" w:type="dxa"/>
+        </w:tblPrEx>
+        <w:tc>
+          <w:tcPr>
+            <w:shd w:val="clear" w:color="auto" w:fill="F4F6FA"/>
+            <w:vAlign w:val="center"/>
+          </w:tcPr>
+          <w:p>
+            <w:pPr>
+              <w:numPr>
+                <w:ilvl w:val="0"/>
+                <w:numId w:val="0"/>
+              </w:numPr>
+              <w:jc w:val="left"/>
+            </w:pPr>
+            <w:r>
+              <w:t>Photography</w:t>
+            </w:r>
+          </w:p>
+        </w:tc>
+        <w:tc>
+          <w:tcPr>
+            <w:shd w:val="clear" w:color="auto" w:fill="F4F6FA"/>
+            <w:vAlign w:val="center"/>
+          </w:tcPr>
+          <w:p>
+            <w:pPr>
+              <w:numPr>
+                <w:ilvl w:val="0"/>
+                <w:numId w:val="0"/>
+              </w:numPr>
+              <w:jc w:val="left"/>
+            </w:pPr>
+            <w:r>
+              <w:t>28</w:t>
+            </w:r>
+          </w:p>
+        </w:tc>
+        <w:tc>
+          <w:tcPr>
+            <w:shd w:val="clear" w:color="auto" w:fill="F4F6FA"/>
+            <w:vAlign w:val="center"/>
+          </w:tcPr>
+          <w:p>
+            <w:pPr>
+              <w:numPr>
+                <w:ilvl w:val="0"/>
+                <w:numId w:val="0"/>
+              </w:numPr>
+              <w:jc w:val="left"/>
+            </w:pPr>
+            <w:r>
+              <w:t>$160</w:t>
+            </w:r>
+          </w:p>
+        </w:tc>
+        <w:tc>
+          <w:tcPr>
+            <w:shd w:val="clear" w:color="auto" w:fill="F4F6FA"/>
+            <w:vAlign w:val="center"/>
+          </w:tcPr>
+          <w:p>
+            <w:pPr>
+              <w:numPr>
+                <w:ilvl w:val="0"/>
+                <w:numId w:val="0"/>
+              </w:numPr>
+              <w:jc w:val="left"/>
+            </w:pPr>
+            <w:r>
+              <w:t>$4,480</w:t>
+            </w:r>
+          </w:p>
+        </w:tc>
+      </w:tr>
+      <w:tr>
+        <w:tblPrEx>
+          <w:tblW w:w="5000" w:type="pct"/>
+          <w:tblInd w:w="0" w:type="dxa"/>
+        </w:tblPrEx>
+        <w:tc>
+          <w:tcPr>
+            <w:shd w:val="clear" w:color="auto" w:fill="FFFFFF"/>
+            <w:vAlign w:val="center"/>
+          </w:tcPr>
+          <w:p>
+            <w:pPr>
+              <w:numPr>
+                <w:ilvl w:val="0"/>
+                <w:numId w:val="0"/>
+              </w:numPr>
+              <w:jc w:val="left"/>
+            </w:pPr>
+            <w:r>
+              <w:t>Brand design</w:t>
+            </w:r>
+          </w:p>
+        </w:tc>
+        <w:tc>
+          <w:tcPr>
+            <w:shd w:val="clear" w:color="auto" w:fill="FFFFFF"/>
+            <w:vAlign w:val="center"/>
+          </w:tcPr>
+          <w:p>
+            <w:pPr>
+              <w:numPr>
+                <w:ilvl w:val="0"/>
+                <w:numId w:val="0"/>
+              </w:numPr>
+              <w:jc w:val="left"/>
+            </w:pPr>
+            <w:r>
+              <w:t>64</w:t>
+            </w:r>
+          </w:p>
+        </w:tc>
+        <w:tc>
+          <w:tcPr>
+            <w:shd w:val="clear" w:color="auto" w:fill="FFFFFF"/>
+            <w:vAlign w:val="center"/>
+          </w:tcPr>
+          <w:p>
+            <w:pPr>
+              <w:numPr>
+                <w:ilvl w:val="0"/>
+                <w:numId w:val="0"/>
+              </w:numPr>
+              <w:jc w:val="left"/>
+            </w:pPr>
+            <w:r>
+              <w:t>$175</w:t>
+            </w:r>
+          </w:p>
+        </w:tc>
+        <w:tc>
+          <w:tcPr>
+            <w:shd w:val="clear" w:color="auto" w:fill="FFFFFF"/>
+            <w:vAlign w:val="center"/>
+          </w:tcPr>
+          <w:p>
+            <w:pPr>
+              <w:numPr>
+                <w:ilvl w:val="0"/>
+                <w:numId w:val="0"/>
+              </w:numPr>
+              <w:jc w:val="left"/>
+            </w:pPr>
+            <w:r>
+              <w:t>$11,200</w:t>
+            </w:r>
+          </w:p>
+        </w:tc>
+      </w:tr>
+      <w:tr>
+        <w:tblPrEx>
+          <w:tblW w:w="5000" w:type="pct"/>
+          <w:tblInd w:w="0" w:type="dxa"/>
+        </w:tblPrEx>
+        <w:tc>
+          <w:tcPr>
+            <w:shd w:val="clear" w:color="auto" w:fill="F4F6FA"/>
+            <w:vAlign w:val="center"/>
+          </w:tcPr>
+          <w:p>
+            <w:pPr>
+              <w:numPr>
+                <w:ilvl w:val="0"/>
+                <w:numId w:val="0"/>
+              </w:numPr>
+              <w:jc w:val="left"/>
+            </w:pPr>
+            <w:r>
+              <w:t>Motion production</w:t>
+            </w:r>
+          </w:p>
+        </w:tc>
+        <w:tc>
+          <w:tcPr>
+            <w:shd w:val="clear" w:color="auto" w:fill="F4F6FA"/>
+            <w:vAlign w:val="center"/>
+          </w:tcPr>
+          <w:p>
+            <w:pPr>
+              <w:numPr>
+                <w:ilvl w:val="0"/>
+                <w:numId w:val="0"/>
+              </w:numPr>
+              <w:jc w:val="left"/>
+            </w:pPr>
+            <w:r>
+              <w:t>72</w:t>
+            </w:r>
+          </w:p>
+        </w:tc>
+        <w:tc>
+          <w:tcPr>
+            <w:shd w:val="clear" w:color="auto" w:fill="F4F6FA"/>
+            <w:vAlign w:val="center"/>
+          </w:tcPr>
+          <w:p>
+            <w:pPr>
+              <w:numPr>
+                <w:ilvl w:val="0"/>
+                <w:numId w:val="0"/>
+              </w:numPr>
+              <w:jc w:val="left"/>
+            </w:pPr>
+            <w:r>
+              <w:t>$185</w:t>
+            </w:r>
+          </w:p>
+        </w:tc>
+        <w:tc>
+          <w:tcPr>
+            <w:shd w:val="clear" w:color="auto" w:fill="F4F6FA"/>
+            <w:vAlign w:val="center"/>
+          </w:tcPr>
+          <w:p>
+            <w:pPr>
+              <w:numPr>
+                <w:ilvl w:val="0"/>
+                <w:numId w:val="0"/>
+              </w:numPr>
+              <w:jc w:val="left"/>
+            </w:pPr>
+            <w:r>
+              <w:t>$13,320</w:t>
+            </w:r>
+          </w:p>
+        </w:tc>
+      </w:tr>
+      <w:tr>
+        <w:tblPrEx>
+          <w:tblW w:w="5000" w:type="pct"/>
+          <w:tblInd w:w="0" w:type="dxa"/>
+        </w:tblPrEx>
+        <w:tc>
+          <w:tcPr>
+            <w:shd w:val="clear" w:color="auto" w:fill="FFFFFF"/>
+            <w:vAlign w:val="center"/>
+          </w:tcPr>
+          <w:p>
+            <w:pPr>
+              <w:numPr>
+                <w:ilvl w:val="0"/>
+                <w:numId w:val="0"/>
+              </w:numPr>
+              <w:jc w:val="left"/>
+            </w:pPr>
+            <w:r>
+              <w:t>Review &amp; delivery</w:t>
+            </w:r>
+          </w:p>
+        </w:tc>
+        <w:tc>
+          <w:tcPr>
+            <w:shd w:val="clear" w:color="auto" w:fill="FFFFFF"/>
+            <w:vAlign w:val="center"/>
+          </w:tcPr>
+          <w:p>
+            <w:pPr>
+              <w:numPr>
+                <w:ilvl w:val="0"/>
+                <w:numId w:val="0"/>
+              </w:numPr>
+              <w:jc w:val="left"/>
+            </w:pPr>
+            <w:r>
+              <w:t>12</w:t>
+            </w:r>
+          </w:p>
+        </w:tc>
+        <w:tc>
+          <w:tcPr>
+            <w:shd w:val="clear" w:color="auto" w:fill="FFFFFF"/>
+            <w:vAlign w:val="center"/>
+          </w:tcPr>
+          <w:p>
+            <w:pPr>
+              <w:numPr>
+                <w:ilvl w:val="0"/>
+                <w:numId w:val="0"/>
+              </w:numPr>
+              <w:jc w:val="left"/>
+            </w:pPr>
+            <w:r>
+              <w:t>$150</w:t>
+            </w:r>
+          </w:p>
+        </w:tc>
+        <w:tc>
+          <w:tcPr>
+            <w:shd w:val="clear" w:color="auto" w:fill="FFFFFF"/>
+            <w:vAlign w:val="center"/>
+          </w:tcPr>
+          <w:p>
+            <w:pPr>
+              <w:numPr>
+                <w:ilvl w:val="0"/>
+                <w:numId w:val="0"/>
+              </w:numPr>
+              <w:jc w:val="left"/>
+            </w:pPr>
+            <w:r>
+              <w:t>$1,800</w:t>
+            </w:r>
+          </w:p>
+        </w:tc>
+      </w:tr>
+    </w:tbl>
     <w:p>
       <w:pPr>
         <w:numPr>
           <w:ilvl w:val="0"/>
           <w:numId w:val="0"/>
         </w:numPr>
-        <w:spacing w:after="200"/>
-        <w:jc w:val="left"/>
-      </w:pPr>
-      <w:r>
-        <w:t>Full terms, licensing, and the studio portfolio are available online:</w:t>
-      </w:r>
-    </w:p>
-    <w:p>
-      <w:pPr>
-        <w:numPr>
-          <w:ilvl w:val="0"/>
-          <w:numId w:val="0"/>
-        </w:numPr>
-        <w:spacing w:after="200"/>
-        <w:jc w:val="left"/>
-      </w:pPr>
-      <w:r>
-        <w:t xml:space="preserve">· </w:t>
-      </w:r>
-      <w:hyperlink r:id="rId6" w:history="1">
-        <w:r>
-          <w:rPr>
-            <w:color w:val="3B7DD8"/>
-            <w:u w:val="single"/>
-          </w:rPr>
-          <w:t>Master services agreement</w:t>
-        </w:r>
-      </w:hyperlink>
-    </w:p>
-    <w:p>
-      <w:pPr>
-        <w:numPr>
-          <w:ilvl w:val="0"/>
-          <w:numId w:val="0"/>
-        </w:numPr>
-        <w:spacing w:after="200"/>
-        <w:jc w:val="left"/>
-      </w:pPr>
-      <w:r>
-        <w:t xml:space="preserve">· </w:t>
-      </w:r>
-      <w:hyperlink r:id="rId7" w:history="1">
-        <w:r>
-          <w:rPr>
-            <w:color w:val="3B7DD8"/>
-            <w:u w:val="single"/>
-          </w:rPr>
-          <w:t>Asset licensing &amp; watermark policy</w:t>
-        </w:r>
-      </w:hyperlink>
-    </w:p>
-    <w:p>
-      <w:pPr>
-        <w:numPr>
-          <w:ilvl w:val="0"/>
-          <w:numId w:val="0"/>
-        </w:numPr>
-        <w:spacing w:after="200"/>
-        <w:jc w:val="left"/>
-      </w:pPr>
-      <w:r>
-        <w:t xml:space="preserve">· </w:t>
-      </w:r>
-      <w:hyperlink r:id="rId8" w:history="1">
-        <w:r>
-          <w:rPr>
-            <w:color w:val="3B7DD8"/>
-            <w:u w:val="single"/>
-          </w:rPr>
-          <w:t>Studio portfolio</w:t>
-        </w:r>
-      </w:hyperlink>
-    </w:p>
-    <w:p>
-      <w:pPr>
-        <w:numPr>
-          <w:ilvl w:val="0"/>
-          <w:numId w:val="0"/>
-        </w:numPr>
-        <w:spacing w:after="200"/>
         <w:jc w:val="left"/>
       </w:pPr>
     </w:p>
     <w:sectPr>
-      <w:footerReference w:type="default" r:id="rId9"/>
-      <w:pgSz w:w="12240" w:h="15840"/>
-      <w:pgMar w:top="1120" w:right="1440" w:bottom="1120" w:left="1440" w:header="720" w:footer="720" w:gutter="0"/>
+      <w:headerReference w:type="default" r:id="rId12"/>
+      <w:footerReference w:type="default" r:id="rId13"/>
+      <w:type w:val="nextPage"/>
+      <w:pgSz w:w="15840" w:h="12240" w:orient="landscape"/>
+      <w:pgMar w:top="1440" w:right="1440" w:bottom="1440" w:left="1440" w:header="720" w:footer="720" w:gutter="0"/>
       <w:cols w:space="720"/>
       <w:docGrid w:linePitch="360"/>
     </w:sectPr>
@@ -1566,7 +2138,7 @@
 </file>
 
 <file path=word/footer1.xml><?xml version="1.0" encoding="utf-8"?>
-<w:ftr xmlns:wpc="http://schemas.microsoft.com/office/word/2010/wordprocessingCanvas" xmlns:cx="http://schemas.microsoft.com/office/drawing/2014/chartex" xmlns:cx1="http://schemas.microsoft.com/office/drawing/2015/9/8/chartex" xmlns:cx2="http://schemas.microsoft.com/office/drawing/2015/10/21/chartex" xmlns:cx3="http://schemas.microsoft.com/office/drawing/2016/5/9/chartex" xmlns:cx4="http://schemas.microsoft.com/office/drawing/2016/5/10/chartex" xmlns:cx5="http://schemas.microsoft.com/office/drawing/2016/5/11/chartex" xmlns:mc="http://schemas.openxmlformats.org/markup-compatibility/2006" xmlns:o="urn:schemas-microsoft-com:office:office" xmlns:r="http://schemas.openxmlformats.org/officeDocument/2006/relationships" xmlns:m="http://schemas.openxmlformats.org/officeDocument/2006/math" xmlns:v="urn:schemas-microsoft-com:vml" xmlns:wp14="http://schemas.microsoft.com/office/word/2010/wordprocessingDrawing" xmlns:wp="http://schemas.openxmlformats.org/drawingml/2006/wordprocessingDrawing" xmlns:w10="urn:schemas-microsoft-com:office:word" xmlns:w="http://schemas.openxmlformats.org/wordprocessingml/2006/main" xmlns:w14="http://schemas.microsoft.com/office/word/2010/wordml" xmlns:w15="http://schemas.microsoft.com/office/word/2012/wordml" xmlns:wne="http://schemas.microsoft.com/office/word/2006/wordml" xmlns:wpg="http://schemas.microsoft.com/office/word/2010/wordprocessingGroup" xmlns:wpi="http://schemas.microsoft.com/office/word/2010/wordprocessingInk" xmlns:wps="http://schemas.microsoft.com/office/word/2010/wordprocessingShape" mc:Ignorable="w14 w15 wp14">
+<w:ftr xmlns:ve="http://schemas.openxmlformats.org/markup-compatibility/2006" xmlns:o="urn:schemas-microsoft-com:office:office" xmlns:r="http://schemas.openxmlformats.org/officeDocument/2006/relationships" xmlns:m="http://schemas.openxmlformats.org/officeDocument/2006/math" xmlns:v="urn:schemas-microsoft-com:vml" xmlns:wp="http://schemas.openxmlformats.org/drawingml/2006/wordprocessingDrawing" xmlns:w10="urn:schemas-microsoft-com:office:word" xmlns:w="http://schemas.openxmlformats.org/wordprocessingml/2006/main" xmlns:wne="http://schemas.microsoft.com/office/word/2006/wordml">
   <w:p>
     <w:pPr>
       <w:jc w:val="center"/>
@@ -1580,14 +2152,244 @@
         <w:color w:val="5B6472"/>
         <w:sz w:val="16"/>
       </w:rPr>
-      <w:t>Aurora Visuals   ·   auroravisuals.example   ·   Confidential</w:t>
+      <w:t xml:space="preserve">Section 1 — Summary   ·   Aurora Visuals   ·   Page </w:t>
+    </w:r>
+    <w:r>
+      <w:rPr>
+        <w:color w:val="5B6472"/>
+        <w:sz w:val="16"/>
+      </w:rPr>
+      <w:fldChar w:fldCharType="begin"/>
+    </w:r>
+    <w:r>
+      <w:rPr>
+        <w:color w:val="5B6472"/>
+        <w:sz w:val="16"/>
+      </w:rPr>
+      <w:instrText>PAGE</w:instrText>
+    </w:r>
+    <w:r>
+      <w:rPr>
+        <w:color w:val="5B6472"/>
+        <w:sz w:val="16"/>
+      </w:rPr>
+      <w:fldChar w:fldCharType="separate"/>
+    </w:r>
+    <w:r>
+      <w:rPr>
+        <w:color w:val="5B6472"/>
+        <w:sz w:val="16"/>
+      </w:rPr>
+      <w:fldChar w:fldCharType="end"/>
     </w:r>
   </w:p>
 </w:ftr>
 </file>
 
+<file path=word/footer2.xml><?xml version="1.0" encoding="utf-8"?>
+<w:ftr xmlns:ve="http://schemas.openxmlformats.org/markup-compatibility/2006" xmlns:o="urn:schemas-microsoft-com:office:office" xmlns:r="http://schemas.openxmlformats.org/officeDocument/2006/relationships" xmlns:m="http://schemas.openxmlformats.org/officeDocument/2006/math" xmlns:v="urn:schemas-microsoft-com:vml" xmlns:wp="http://schemas.openxmlformats.org/drawingml/2006/wordprocessingDrawing" xmlns:w10="urn:schemas-microsoft-com:office:word" xmlns:w="http://schemas.openxmlformats.org/wordprocessingml/2006/main" xmlns:wne="http://schemas.microsoft.com/office/word/2006/wordml">
+  <w:p>
+    <w:pPr>
+      <w:jc w:val="center"/>
+      <w:rPr>
+        <w:color w:val="5B6472"/>
+        <w:sz w:val="16"/>
+      </w:rPr>
+    </w:pPr>
+    <w:r>
+      <w:rPr>
+        <w:color w:val="5B6472"/>
+        <w:sz w:val="16"/>
+      </w:rPr>
+      <w:t xml:space="preserve">Section 2 — Campaign review   ·   Aurora Visuals   ·   Page </w:t>
+    </w:r>
+    <w:r>
+      <w:rPr>
+        <w:color w:val="5B6472"/>
+        <w:sz w:val="16"/>
+      </w:rPr>
+      <w:fldChar w:fldCharType="begin"/>
+    </w:r>
+    <w:r>
+      <w:rPr>
+        <w:color w:val="5B6472"/>
+        <w:sz w:val="16"/>
+      </w:rPr>
+      <w:instrText>PAGE</w:instrText>
+    </w:r>
+    <w:r>
+      <w:rPr>
+        <w:color w:val="5B6472"/>
+        <w:sz w:val="16"/>
+      </w:rPr>
+      <w:fldChar w:fldCharType="separate"/>
+    </w:r>
+    <w:r>
+      <w:rPr>
+        <w:color w:val="5B6472"/>
+        <w:sz w:val="16"/>
+      </w:rPr>
+      <w:fldChar w:fldCharType="end"/>
+    </w:r>
+  </w:p>
+</w:ftr>
+</file>
+
+<file path=word/footer3.xml><?xml version="1.0" encoding="utf-8"?>
+<w:ftr xmlns:ve="http://schemas.openxmlformats.org/markup-compatibility/2006" xmlns:o="urn:schemas-microsoft-com:office:office" xmlns:r="http://schemas.openxmlformats.org/officeDocument/2006/relationships" xmlns:m="http://schemas.openxmlformats.org/officeDocument/2006/math" xmlns:v="urn:schemas-microsoft-com:vml" xmlns:wp="http://schemas.openxmlformats.org/drawingml/2006/wordprocessingDrawing" xmlns:w10="urn:schemas-microsoft-com:office:word" xmlns:w="http://schemas.openxmlformats.org/wordprocessingml/2006/main" xmlns:wne="http://schemas.microsoft.com/office/word/2006/wordml">
+  <w:p>
+    <w:pPr>
+      <w:jc w:val="center"/>
+      <w:rPr>
+        <w:color w:val="5B6472"/>
+        <w:sz w:val="16"/>
+      </w:rPr>
+    </w:pPr>
+    <w:r>
+      <w:rPr>
+        <w:color w:val="5B6472"/>
+        <w:sz w:val="16"/>
+      </w:rPr>
+      <w:t xml:space="preserve">Section 3 — Appendix   ·   Aurora Visuals   ·   Page </w:t>
+    </w:r>
+    <w:r>
+      <w:rPr>
+        <w:color w:val="5B6472"/>
+        <w:sz w:val="16"/>
+      </w:rPr>
+      <w:fldChar w:fldCharType="begin"/>
+    </w:r>
+    <w:r>
+      <w:rPr>
+        <w:color w:val="5B6472"/>
+        <w:sz w:val="16"/>
+      </w:rPr>
+      <w:instrText>PAGE</w:instrText>
+    </w:r>
+    <w:r>
+      <w:rPr>
+        <w:color w:val="5B6472"/>
+        <w:sz w:val="16"/>
+      </w:rPr>
+      <w:fldChar w:fldCharType="separate"/>
+    </w:r>
+    <w:r>
+      <w:rPr>
+        <w:color w:val="5B6472"/>
+        <w:sz w:val="16"/>
+      </w:rPr>
+      <w:fldChar w:fldCharType="end"/>
+    </w:r>
+  </w:p>
+</w:ftr>
+</file>
+
+<file path=word/header1.xml><?xml version="1.0" encoding="utf-8"?>
+<w:hdr xmlns:ve="http://schemas.openxmlformats.org/markup-compatibility/2006" xmlns:o="urn:schemas-microsoft-com:office:office" xmlns:r="http://schemas.openxmlformats.org/officeDocument/2006/relationships" xmlns:m="http://schemas.openxmlformats.org/officeDocument/2006/math" xmlns:v="urn:schemas-microsoft-com:vml" xmlns:wp="http://schemas.openxmlformats.org/drawingml/2006/wordprocessingDrawing" xmlns:w10="urn:schemas-microsoft-com:office:word" xmlns:w="http://schemas.openxmlformats.org/wordprocessingml/2006/main" xmlns:wne="http://schemas.microsoft.com/office/word/2006/wordml">
+  <w:p>
+    <w:pPr>
+      <w:jc w:val="left"/>
+      <w:rPr>
+        <w:color w:val="5B6472"/>
+        <w:sz w:val="16"/>
+      </w:rPr>
+    </w:pPr>
+    <w:r>
+      <w:drawing>
+        <wp:inline>
+          <wp:extent cx="1270000" cy="381000"/>
+          <wp:docPr id="100001" name="Header logo"/>
+          <wp:cNvGraphicFramePr>
+            <a:graphicFrameLocks xmlns:a="http://schemas.openxmlformats.org/drawingml/2006/main" noChangeAspect="1"/>
+          </wp:cNvGraphicFramePr>
+          <a:graphic xmlns:a="http://schemas.openxmlformats.org/drawingml/2006/main">
+            <a:graphicData uri="http://schemas.openxmlformats.org/drawingml/2006/picture">
+              <pic:pic xmlns:pic="http://schemas.openxmlformats.org/drawingml/2006/picture">
+                <pic:nvPicPr>
+                  <pic:cNvPr id="100001" name=""/>
+                  <pic:cNvPicPr>
+                    <a:picLocks noChangeAspect="1"/>
+                  </pic:cNvPicPr>
+                </pic:nvPicPr>
+                <pic:blipFill>
+                  <a:blip xmlns:r="http://schemas.openxmlformats.org/officeDocument/2006/relationships" r:embed="rId1"/>
+                  <a:stretch>
+                    <a:fillRect/>
+                  </a:stretch>
+                </pic:blipFill>
+                <pic:spPr>
+                  <a:xfrm>
+                    <a:off x="0" y="0"/>
+                    <a:ext cx="1270000" cy="381000"/>
+                  </a:xfrm>
+                  <a:prstGeom prst="rect">
+                    <a:avLst/>
+                  </a:prstGeom>
+                </pic:spPr>
+              </pic:pic>
+            </a:graphicData>
+          </a:graphic>
+        </wp:inline>
+      </w:drawing>
+    </w:r>
+    <w:r>
+      <w:t xml:space="preserve">   </w:t>
+    </w:r>
+    <w:r>
+      <w:rPr>
+        <w:color w:val="5B6472"/>
+        <w:sz w:val="16"/>
+      </w:rPr>
+      <w:t>Campaign Report · Northwind Coffee Roasters</w:t>
+    </w:r>
+  </w:p>
+</w:hdr>
+</file>
+
+<file path=word/header2.xml><?xml version="1.0" encoding="utf-8"?>
+<w:hdr xmlns:ve="http://schemas.openxmlformats.org/markup-compatibility/2006" xmlns:o="urn:schemas-microsoft-com:office:office" xmlns:r="http://schemas.openxmlformats.org/officeDocument/2006/relationships" xmlns:m="http://schemas.openxmlformats.org/officeDocument/2006/math" xmlns:v="urn:schemas-microsoft-com:vml" xmlns:wp="http://schemas.openxmlformats.org/drawingml/2006/wordprocessingDrawing" xmlns:w10="urn:schemas-microsoft-com:office:word" xmlns:w="http://schemas.openxmlformats.org/wordprocessingml/2006/main" xmlns:wne="http://schemas.microsoft.com/office/word/2006/wordml">
+  <w:p>
+    <w:pPr>
+      <w:jc w:val="left"/>
+      <w:rPr>
+        <w:color w:val="5B6472"/>
+        <w:sz w:val="16"/>
+      </w:rPr>
+    </w:pPr>
+    <w:r>
+      <w:rPr>
+        <w:color w:val="5B6472"/>
+        <w:sz w:val="16"/>
+      </w:rPr>
+      <w:t>Campaign review · Q1 2026</w:t>
+    </w:r>
+  </w:p>
+</w:hdr>
+</file>
+
+<file path=word/header3.xml><?xml version="1.0" encoding="utf-8"?>
+<w:hdr xmlns:ve="http://schemas.openxmlformats.org/markup-compatibility/2006" xmlns:o="urn:schemas-microsoft-com:office:office" xmlns:r="http://schemas.openxmlformats.org/officeDocument/2006/relationships" xmlns:m="http://schemas.openxmlformats.org/officeDocument/2006/math" xmlns:v="urn:schemas-microsoft-com:vml" xmlns:wp="http://schemas.openxmlformats.org/drawingml/2006/wordprocessingDrawing" xmlns:w10="urn:schemas-microsoft-com:office:word" xmlns:w="http://schemas.openxmlformats.org/wordprocessingml/2006/main" xmlns:wne="http://schemas.microsoft.com/office/word/2006/wordml">
+  <w:p>
+    <w:pPr>
+      <w:jc w:val="left"/>
+      <w:rPr>
+        <w:color w:val="5B6472"/>
+        <w:sz w:val="16"/>
+      </w:rPr>
+    </w:pPr>
+    <w:r>
+      <w:rPr>
+        <w:color w:val="5B6472"/>
+        <w:sz w:val="16"/>
+      </w:rPr>
+      <w:t>Appendix — Rates and budget</w:t>
+    </w:r>
+  </w:p>
+</w:hdr>
+</file>
+
 <file path=word/numbering.xml><?xml version="1.0" encoding="utf-8"?>
-<w:numbering xmlns:wpc="http://schemas.microsoft.com/office/word/2010/wordprocessingCanvas" xmlns:cx="http://schemas.microsoft.com/office/drawing/2014/chartex" xmlns:cx1="http://schemas.microsoft.com/office/drawing/2015/9/8/chartex" xmlns:cx2="http://schemas.microsoft.com/office/drawing/2015/10/21/chartex" xmlns:cx3="http://schemas.microsoft.com/office/drawing/2016/5/9/chartex" xmlns:cx4="http://schemas.microsoft.com/office/drawing/2016/5/10/chartex" xmlns:cx5="http://schemas.microsoft.com/office/drawing/2016/5/11/chartex" xmlns:mc="http://schemas.openxmlformats.org/markup-compatibility/2006" xmlns:o="urn:schemas-microsoft-com:office:office" xmlns:r="http://schemas.openxmlformats.org/officeDocument/2006/relationships" xmlns:m="http://schemas.openxmlformats.org/officeDocument/2006/math" xmlns:v="urn:schemas-microsoft-com:vml" xmlns:wp14="http://schemas.microsoft.com/office/word/2010/wordprocessingDrawing" xmlns:wp="http://schemas.openxmlformats.org/drawingml/2006/wordprocessingDrawing" xmlns:w10="urn:schemas-microsoft-com:office:word" xmlns:w="http://schemas.openxmlformats.org/wordprocessingml/2006/main" xmlns:w14="http://schemas.microsoft.com/office/word/2010/wordml" xmlns:w15="http://schemas.microsoft.com/office/word/2012/wordml" xmlns:wne="http://schemas.microsoft.com/office/word/2006/wordml" xmlns:wpg="http://schemas.microsoft.com/office/word/2010/wordprocessingGroup" xmlns:wpi="http://schemas.microsoft.com/office/word/2010/wordprocessingInk" xmlns:wps="http://schemas.microsoft.com/office/word/2010/wordprocessingShape" mc:Ignorable="w14 w15 wp14">
+<w:numbering xmlns:ve="http://schemas.openxmlformats.org/markup-compatibility/2006" xmlns:o="urn:schemas-microsoft-com:office:office" xmlns:r="http://schemas.openxmlformats.org/officeDocument/2006/relationships" xmlns:m="http://schemas.openxmlformats.org/officeDocument/2006/math" xmlns:v="urn:schemas-microsoft-com:vml" xmlns:wp="http://schemas.openxmlformats.org/drawingml/2006/wordprocessingDrawing" xmlns:w10="urn:schemas-microsoft-com:office:word" xmlns:w="http://schemas.openxmlformats.org/wordprocessingml/2006/main" xmlns:wne="http://schemas.microsoft.com/office/word/2006/wordml">
   <w:abstractNum w:abstractNumId="0">
     <w:nsid w:val="00000001"/>
     <w:multiLevelType w:val="hybridMultilevel"/>
@@ -1730,12 +2532,12 @@
   </w:abstractNum>
   <w:abstractNum w:abstractNumId="1">
     <w:nsid w:val="00000002"/>
-    <w:multiLevelType w:val="multilevel"/>
+    <w:multiLevelType w:val="hybridMultilevel"/>
     <w:tmpl w:val="00000002"/>
     <w:lvl w:ilvl="0">
       <w:start w:val="1"/>
-      <w:numFmt w:val="decimal"/>
-      <w:lvlText w:val="%1."/>
+      <w:numFmt w:val="bullet"/>
+      <w:lvlText w:val=""/>
       <w:lvlJc w:val="left"/>
       <w:pPr>
         <w:tabs>
@@ -1743,11 +2545,14 @@
         </w:tabs>
         <w:ind w:left="720" w:hanging="360"/>
       </w:pPr>
+      <w:rPr>
+        <w:rFonts w:ascii="Symbol" w:hAnsi="Symbol"/>
+      </w:rPr>
     </w:lvl>
     <w:lvl w:ilvl="1">
       <w:start w:val="1"/>
-      <w:numFmt w:val="lowerLetter"/>
-      <w:lvlText w:val="%2."/>
+      <w:numFmt w:val="bullet"/>
+      <w:lvlText w:val="o"/>
       <w:lvlJc w:val="left"/>
       <w:pPr>
         <w:tabs>
@@ -1755,23 +2560,29 @@
         </w:tabs>
         <w:ind w:left="1440" w:hanging="360"/>
       </w:pPr>
+      <w:rPr>
+        <w:rFonts w:ascii="Courier New" w:hAnsi="Courier New"/>
+      </w:rPr>
     </w:lvl>
     <w:lvl w:ilvl="2">
       <w:start w:val="1"/>
-      <w:numFmt w:val="lowerRoman"/>
-      <w:lvlText w:val="%3."/>
-      <w:lvlJc w:val="right"/>
+      <w:numFmt w:val="bullet"/>
+      <w:lvlText w:val=""/>
+      <w:lvlJc w:val="left"/>
       <w:pPr>
         <w:tabs>
           <w:tab w:val="num" w:pos="2160"/>
         </w:tabs>
-        <w:ind w:left="2160" w:hanging="180"/>
-      </w:pPr>
+        <w:ind w:left="2160" w:hanging="360"/>
+      </w:pPr>
+      <w:rPr>
+        <w:rFonts w:ascii="Wingdings" w:hAnsi="Wingdings"/>
+      </w:rPr>
     </w:lvl>
     <w:lvl w:ilvl="3">
       <w:start w:val="1"/>
-      <w:numFmt w:val="decimal"/>
-      <w:lvlText w:val="%4."/>
+      <w:numFmt w:val="bullet"/>
+      <w:lvlText w:val=""/>
       <w:lvlJc w:val="left"/>
       <w:pPr>
         <w:tabs>
@@ -1779,11 +2590,14 @@
         </w:tabs>
         <w:ind w:left="2880" w:hanging="360"/>
       </w:pPr>
+      <w:rPr>
+        <w:rFonts w:ascii="Symbol" w:hAnsi="Symbol"/>
+      </w:rPr>
     </w:lvl>
     <w:lvl w:ilvl="4">
       <w:start w:val="1"/>
-      <w:numFmt w:val="lowerLetter"/>
-      <w:lvlText w:val="%5."/>
+      <w:numFmt w:val="bullet"/>
+      <w:lvlText w:val="o"/>
       <w:lvlJc w:val="left"/>
       <w:pPr>
         <w:tabs>
@@ -1791,23 +2605,29 @@
         </w:tabs>
         <w:ind w:left="3600" w:hanging="360"/>
       </w:pPr>
+      <w:rPr>
+        <w:rFonts w:ascii="Courier New" w:hAnsi="Courier New"/>
+      </w:rPr>
     </w:lvl>
     <w:lvl w:ilvl="5">
       <w:start w:val="1"/>
-      <w:numFmt w:val="lowerRoman"/>
-      <w:lvlText w:val="%6."/>
-      <w:lvlJc w:val="right"/>
+      <w:numFmt w:val="bullet"/>
+      <w:lvlText w:val=""/>
+      <w:lvlJc w:val="left"/>
       <w:pPr>
         <w:tabs>
           <w:tab w:val="num" w:pos="4320"/>
         </w:tabs>
-        <w:ind w:left="4320" w:hanging="180"/>
-      </w:pPr>
+        <w:ind w:left="4320" w:hanging="360"/>
+      </w:pPr>
+      <w:rPr>
+        <w:rFonts w:ascii="Wingdings" w:hAnsi="Wingdings"/>
+      </w:rPr>
     </w:lvl>
     <w:lvl w:ilvl="6">
       <w:start w:val="1"/>
-      <w:numFmt w:val="decimal"/>
-      <w:lvlText w:val="%7."/>
+      <w:numFmt w:val="bullet"/>
+      <w:lvlText w:val=""/>
       <w:lvlJc w:val="left"/>
       <w:pPr>
         <w:tabs>
@@ -1815,11 +2635,14 @@
         </w:tabs>
         <w:ind w:left="5040" w:hanging="360"/>
       </w:pPr>
+      <w:rPr>
+        <w:rFonts w:ascii="Symbol" w:hAnsi="Symbol"/>
+      </w:rPr>
     </w:lvl>
     <w:lvl w:ilvl="7">
       <w:start w:val="1"/>
-      <w:numFmt w:val="lowerLetter"/>
-      <w:lvlText w:val="%8."/>
+      <w:numFmt w:val="bullet"/>
+      <w:lvlText w:val="o"/>
       <w:lvlJc w:val="left"/>
       <w:pPr>
         <w:tabs>
@@ -1827,18 +2650,24 @@
         </w:tabs>
         <w:ind w:left="5760" w:hanging="360"/>
       </w:pPr>
+      <w:rPr>
+        <w:rFonts w:ascii="Courier New" w:hAnsi="Courier New"/>
+      </w:rPr>
     </w:lvl>
     <w:lvl w:ilvl="8">
       <w:start w:val="1"/>
-      <w:numFmt w:val="lowerRoman"/>
-      <w:lvlText w:val="%9."/>
-      <w:lvlJc w:val="right"/>
+      <w:numFmt w:val="bullet"/>
+      <w:lvlText w:val=""/>
+      <w:lvlJc w:val="left"/>
       <w:pPr>
         <w:tabs>
           <w:tab w:val="num" w:pos="6480"/>
         </w:tabs>
-        <w:ind w:left="6480" w:hanging="180"/>
-      </w:pPr>
+        <w:ind w:left="6480" w:hanging="360"/>
+      </w:pPr>
+      <w:rPr>
+        <w:rFonts w:ascii="Wingdings" w:hAnsi="Wingdings"/>
+      </w:rPr>
     </w:lvl>
   </w:abstractNum>
   <w:num w:numId="1">
@@ -1851,7 +2680,7 @@
 </file>
 
 <file path=word/styles.xml><?xml version="1.0" encoding="utf-8"?>
-<w:styles xmlns:mc="http://schemas.openxmlformats.org/markup-compatibility/2006" xmlns:r="http://schemas.openxmlformats.org/officeDocument/2006/relationships" xmlns:w="http://schemas.openxmlformats.org/wordprocessingml/2006/main" xmlns:w14="http://schemas.microsoft.com/office/word/2010/wordml" xmlns:w15="http://schemas.microsoft.com/office/word/2012/wordml" mc:Ignorable="w14 w15">
+<w:styles xmlns:r="http://schemas.openxmlformats.org/officeDocument/2006/relationships" xmlns:w="http://schemas.openxmlformats.org/wordprocessingml/2006/main">
   <w:docDefaults>
     <w:rPrDefault>
       <w:rPr>
@@ -1992,8 +2821,13 @@
   <w:style w:type="paragraph" w:default="1" w:styleId="Normal">
     <w:name w:val="Normal"/>
     <w:qFormat/>
+    <w:pPr>
+      <w:spacing w:after="120"/>
+    </w:pPr>
     <w:rPr>
-      <w:sz w:val="24"/>
+      <w:rFonts w:ascii="Arial" w:eastAsia="Arial" w:hAnsi="Arial" w:cs="Arial"/>
+      <w:color w:val="2E3440"/>
+      <w:sz w:val="21"/>
       <w:szCs w:val="24"/>
     </w:rPr>
   </w:style>
@@ -2009,12 +2843,33 @@
       <w:outlineLvl w:val="0"/>
     </w:pPr>
     <w:rPr>
-      <w:rFonts w:ascii="Arial" w:hAnsi="Arial" w:cs="Arial"/>
+      <w:rFonts w:ascii="Arial" w:eastAsia="Arial" w:hAnsi="Arial" w:cs="Arial"/>
       <w:b/>
       <w:bCs/>
       <w:kern w:val="32"/>
       <w:sz w:val="32"/>
       <w:szCs w:val="32"/>
+    </w:rPr>
+  </w:style>
+  <w:style w:type="paragraph" w:styleId="Heading2">
+    <w:name w:val="heading 2"/>
+    <w:basedOn w:val="Normal"/>
+    <w:next w:val="Normal"/>
+    <w:qFormat/>
+    <w:rsid w:val="00EF7B96"/>
+    <w:pPr>
+      <w:keepNext/>
+      <w:spacing w:before="240" w:after="60"/>
+      <w:outlineLvl w:val="1"/>
+    </w:pPr>
+    <w:rPr>
+      <w:rFonts w:ascii="Arial" w:eastAsia="Arial" w:hAnsi="Arial" w:cs="Arial"/>
+      <w:b/>
+      <w:bCs/>
+      <w:i/>
+      <w:iCs/>
+      <w:sz w:val="28"/>
+      <w:szCs w:val="28"/>
     </w:rPr>
   </w:style>
   <w:style w:type="character" w:default="1" w:styleId="DefaultParagraphFont">
@@ -2049,11 +2904,11 @@
       <w:outlineLvl w:val="0"/>
     </w:pPr>
     <w:rPr>
-      <w:rFonts w:ascii="Arial" w:hAnsi="Arial" w:cs="Arial"/>
+      <w:rFonts w:ascii="Arial" w:eastAsia="Arial" w:hAnsi="Arial" w:cs="Arial"/>
       <w:b/>
       <w:bCs/>
       <w:kern w:val="28"/>
-      <w:sz w:val="32"/>
+      <w:sz w:val="60"/>
       <w:szCs w:val="32"/>
     </w:rPr>
   </w:style>
@@ -2068,7 +2923,7 @@
       <w:outlineLvl w:val="1"/>
     </w:pPr>
     <w:rPr>
-      <w:rFonts w:ascii="Arial" w:hAnsi="Arial" w:cs="Arial"/>
+      <w:rFonts w:ascii="Arial" w:eastAsia="Arial" w:hAnsi="Arial" w:cs="Arial"/>
     </w:rPr>
   </w:style>
 </w:styles>

</xml_diff>